<commit_message>
Fix: Convert tables to booktabs format, embed bibliography, prepare ScholarOne submission
- Converted tbl-nationalism.tex, tbl-regression-educ.tex, tbl-regression-full-2004.tex from tabularray to booktabs + threeparttable format
- Fixed table notes with proper math-mode significance legend: Note: + $p < .1$, * $p < .05$, ** $p < .01$, *** $p < .001$
- Removed siunitx package and \num{} formatting throughout
- Embedded .bbl bibliography directly in manuscript_R1.tex (no external compilation needed)
- Cleaned up submission_package/ with only referenced files in required formats
- Updated AGENTS.md with October 2026 session status
- All files verified to compile locally with pdflatex
- Ready for re-upload to ScholarOne
</commit_message>
<xml_diff>
--- a/resubmission/Word/manuscript_R1.docx
+++ b/resubmission/Word/manuscript_R1.docx
@@ -1271,6 +1271,9 @@
         <w:t xml:space="preserve"> </w:t>
       </w:r>
       <w:r>
+        <w:t xml:space="preserve">(Adorno et al. 1950)</w:t>
+      </w:r>
+      <w:r>
         <w:t xml:space="preserve"> </w:t>
       </w:r>
       <w:r>
@@ -1280,6 +1283,9 @@
         <w:t xml:space="preserve"> </w:t>
       </w:r>
       <w:r>
+        <w:t xml:space="preserve">(Jost et al. 2007, 2017; Jost, Nosek, and Gosling 2008)</w:t>
+      </w:r>
+      <w:r>
         <w:t xml:space="preserve"> </w:t>
       </w:r>
       <w:r>
@@ -1319,6 +1325,9 @@
         <w:t xml:space="preserve"> </w:t>
       </w:r>
       <w:r>
+        <w:t xml:space="preserve">(Giddens 1984)</w:t>
+      </w:r>
+      <w:r>
         <w:t xml:space="preserve"> </w:t>
       </w:r>
       <w:r>
@@ -1328,6 +1337,9 @@
         <w:t xml:space="preserve"> </w:t>
       </w:r>
       <w:r>
+        <w:t xml:space="preserve">(Wuthnow 2019)</w:t>
+      </w:r>
+      <w:r>
         <w:t xml:space="preserve">.</w:t>
       </w:r>
     </w:p>
@@ -1340,6 +1352,9 @@
       </w:r>
       <w:r>
         <w:t xml:space="preserve"> </w:t>
+      </w:r>
+      <w:r>
+        <w:t xml:space="preserve">(Lawler 1992; Mueller and Lawler 1999)</w:t>
       </w:r>
       <w:r>
         <w:t xml:space="preserve">, on the other hand, point to a different dynamic. In this view, individuals belong simultaneously to a series of nested collectivities, from small, local, face-to-face groups up through progressively larger and more abstract ones, culminating in the nation itself. According to the theory, a</w:t>
@@ -1441,10 +1456,16 @@
         <w:t xml:space="preserve"> </w:t>
       </w:r>
       <w:r>
+        <w:t xml:space="preserve">(Kohn 1977; Kohn and Schooler 1969, 1978)</w:t>
+      </w:r>
+      <w:r>
         <w:t xml:space="preserve">, and given that they are more likely to belong to “nested-subgroups," such as voluntary associations</w:t>
       </w:r>
       <w:r>
         <w:t xml:space="preserve"> </w:t>
+      </w:r>
+      <w:r>
+        <w:t xml:space="preserve">(Bell and Force 1956; Dederichs 2024; Freeman, Novak, and Reeder 1957; Janoski and Wilson 1996; Knoke 1986; McPherson 1981; Scott 1957; Tomeh 1973)</w:t>
       </w:r>
       <w:r>
         <w:t xml:space="preserve">, within which feelings of attachment to super-ordinate collectivities can be fostered and made salient, we should expect them to be more likely to experience renewed feelings of national pride following a threat to the nation.</w:t>
@@ -1488,6 +1509,9 @@
         <w:t xml:space="preserve"> </w:t>
       </w:r>
       <w:r>
+        <w:t xml:space="preserve">(Jost et al. 2007)</w:t>
+      </w:r>
+      <w:r>
         <w:t xml:space="preserve">. Thus, classic studies of the authoritarian personality noted how persons who scored high on authoritarianism scales were also prone to express</w:t>
       </w:r>
       <w:r>
@@ -1528,6 +1552,9 @@
       </w:r>
       <w:r>
         <w:t xml:space="preserve"> </w:t>
+      </w:r>
+      <w:r>
+        <w:t xml:space="preserve">(Adorno et al. 1950; Pettigrew 1999)</w:t>
       </w:r>
       <w:r>
         <w:t xml:space="preserve">.</w:t>
@@ -1560,6 +1587,9 @@
         <w:t xml:space="preserve"> </w:t>
       </w:r>
       <w:r>
+        <w:t xml:space="preserve">Schatz, Staub, and Lavine (1999)</w:t>
+      </w:r>
+      <w:r>
         <w:t xml:space="preserve"> </w:t>
       </w:r>
       <w:r>
@@ -1595,6 +1625,9 @@
         <w:t xml:space="preserve"> </w:t>
       </w:r>
       <w:r>
+        <w:t xml:space="preserve">(Santos and Jost 2024)</w:t>
+      </w:r>
+      <w:r>
         <w:t xml:space="preserve">.</w:t>
       </w:r>
     </w:p>
@@ -1609,6 +1642,9 @@
         <w:t xml:space="preserve"> </w:t>
       </w:r>
       <w:r>
+        <w:t xml:space="preserve">(Hogg and Terry 2000)</w:t>
+      </w:r>
+      <w:r>
         <w:t xml:space="preserve">. Rather than tracing national attachment to an authoritarian personality structure, social identity accounts locate its source in a self-esteem/self-enhancement motive: individuals derive positive self-regard from membership in groups perceived as prestigious. These same individuals are consequently motivated to identify with, and express pride in, high-status collectivities such as the nation. This is a different specific psychological need than the one emphasized by the authoritarian-personality tradition—self-enhancement rather than order, certainty, or ego-defense—but it is a psychological need in the same structural sense, since national attachment is explained, in both traditions, as the servicing of a standing motivational deficit that exists prior to, and independently of, any particular structural position or lived experience of autonomy in concrete nested groups.</w:t>
       </w:r>
     </w:p>
@@ -1623,10 +1659,16 @@
         <w:t xml:space="preserve"> </w:t>
       </w:r>
       <w:r>
+        <w:t xml:space="preserve">(Wuthnow 2019)</w:t>
+      </w:r>
+      <w:r>
         <w:t xml:space="preserve">, enhancing the need for collective sources of self-esteem</w:t>
       </w:r>
       <w:r>
         <w:t xml:space="preserve"> </w:t>
+      </w:r>
+      <w:r>
+        <w:t xml:space="preserve">(Collins 1986; Jost et al. 2003; Jost 2017)</w:t>
       </w:r>
       <w:r>
         <w:t xml:space="preserve">. This implies that post-9/11 increases in national affective attachment in the U.S. should be concentrated among lower-status groups, who may be more likely to react to epistemic and existential threats to the status quo by becoming affectively attached to the nation, thereby increasing their belief in the propriety and desirability of existing systems in the face of threat.</w:t>
@@ -1651,6 +1693,9 @@
       </w:r>
       <w:r>
         <w:t xml:space="preserve"> </w:t>
+      </w:r>
+      <w:r>
+        <w:t xml:space="preserve">(1992)</w:t>
       </w:r>
       <w:r>
         <w:t xml:space="preserve"> </w:t>
@@ -1675,6 +1720,9 @@
         <w:t xml:space="preserve"> </w:t>
       </w:r>
       <w:r>
+        <w:t xml:space="preserve">(Fine 2021)</w:t>
+      </w:r>
+      <w:r>
         <w:t xml:space="preserve">. Positive emotions stemming from the sense of autonomy and control afforded by the group trigger an attribution process—whereby the group is seen as responsible for the positive feelings and the sense of efficacy—that leads people to become affectively attached to those groups and, by implication, to any larger group within which those groups are nested.</w:t>
       </w:r>
     </w:p>
@@ -1722,6 +1770,9 @@
         <w:t xml:space="preserve"> </w:t>
       </w:r>
       <w:r>
+        <w:t xml:space="preserve">(1991)</w:t>
+      </w:r>
+      <w:r>
         <w:t xml:space="preserve"> </w:t>
       </w:r>
       <w:r>
@@ -1747,6 +1798,9 @@
       </w:r>
       <w:r>
         <w:t xml:space="preserve"> </w:t>
+      </w:r>
+      <w:r>
+        <w:t xml:space="preserve">(Swidler 1992)</w:t>
       </w:r>
       <w:r>
         <w:t xml:space="preserve">, a</w:t>
@@ -1779,6 +1833,9 @@
         <w:t xml:space="preserve"> </w:t>
       </w:r>
       <w:r>
+        <w:t xml:space="preserve">(1992)</w:t>
+      </w:r>
+      <w:r>
         <w:t xml:space="preserve"> </w:t>
       </w:r>
       <w:r>
@@ -1817,6 +1874,9 @@
         <w:t xml:space="preserve">group that becomes the object of the attribution process. This proximal-to-distal shift is expected to occur when the rituals and symbols of the larger collectivity become salient enough to override the interactional advantage ordinarily enjoyed by proximal subgroups, or when structural circumstances make the larger unit, rather than the local one, the perceived source of the individual’s sense of control (</w:t>
       </w:r>
       <w:r>
+        <w:t xml:space="preserve">(Lawler 1992:610–20)</w:t>
+      </w:r>
+      <w:r>
         <w:t xml:space="preserve">).</w:t>
       </w:r>
     </w:p>
@@ -1829,6 +1889,9 @@
       </w:r>
       <w:r>
         <w:t xml:space="preserve"> </w:t>
+      </w:r>
+      <w:r>
+        <w:t xml:space="preserve">Lawler, Thye, and Yoon (2006)</w:t>
       </w:r>
       <w:r>
         <w:t xml:space="preserve">, who show that exchange relations that are</w:t>
@@ -1889,6 +1952,9 @@
         <w:t xml:space="preserve"> </w:t>
       </w:r>
       <w:r>
+        <w:t xml:space="preserve">Perrin (2005)</w:t>
+      </w:r>
+      <w:r>
         <w:t xml:space="preserve"> </w:t>
       </w:r>
       <w:r>
@@ -1896,6 +1962,9 @@
       </w:r>
       <w:r>
         <w:t xml:space="preserve"> </w:t>
+      </w:r>
+      <w:r>
+        <w:t xml:space="preserve">Schatz and Lavine (2007)</w:t>
       </w:r>
       <w:r>
         <w:t xml:space="preserve"> </w:t>
@@ -1931,6 +2000,9 @@
         <w:t xml:space="preserve"> </w:t>
       </w:r>
       <w:r>
+        <w:t xml:space="preserve">Sullivan, Fried, and Dietz (1992)</w:t>
+      </w:r>
+      <w:r>
         <w:t xml:space="preserve">, studying the 1988 U.S. presidential campaign, find that a distinct</w:t>
       </w:r>
       <w:r>
@@ -2018,6 +2090,9 @@
         <w:t xml:space="preserve"> </w:t>
       </w:r>
       <w:r>
+        <w:t xml:space="preserve">(Collins 2004)</w:t>
+      </w:r>
+      <w:r>
         <w:t xml:space="preserve">—plausibly elevated and then sustained the salience of the nation relative to the local subgroups that ordinarily receive credit for individuals’ sense of autonomy and control. On this reading, the subsequent wars are not a confound to be partialed out of a 9/11</w:t>
       </w:r>
       <w:r>
@@ -2066,6 +2141,9 @@
         <w:t xml:space="preserve"> </w:t>
       </w:r>
       <w:r>
+        <w:t xml:space="preserve">(Lawler et al. 2006)</w:t>
+      </w:r>
+      <w:r>
         <w:t xml:space="preserve">. When the distal rule is activated, this credit cascades upward, as the same structural position that enables an individual to experience efficacious action within a nested subgroup also supplies the raw material for positive affect that becomes available for reattribution to the nation. Therefore, efficacious action in structured social arenas and embeddedness in nested subgroups should be positively connected to affective attachment to the national collectivity when the proximal rule is weakened.</w:t>
       </w:r>
     </w:p>
@@ -2089,6 +2167,9 @@
       </w:r>
       <w:r>
         <w:t xml:space="preserve"> </w:t>
+      </w:r>
+      <w:r>
+        <w:t xml:space="preserve">(Smith, Hout, and Marsden 2021)</w:t>
       </w:r>
       <w:r>
         <w:t xml:space="preserve">), managed by NORC at the University of Chicago. Collected before and after the events of September 11, 2001, these two waves are particularly well suited to address the study’s main questions because they include a special module on attitudes toward the United States, providing an ideal natural experiment to assess shifts in national attachment. Data were accessed using the</w:t>
@@ -2112,6 +2193,9 @@
         <w:t xml:space="preserve"> </w:t>
       </w:r>
       <w:r>
+        <w:t xml:space="preserve">(Healy 2024)</w:t>
+      </w:r>
+      <w:r>
         <w:t xml:space="preserve">, which provides convenient access to GSS data through the official NORC API.</w:t>
       </w:r>
     </w:p>
@@ -2211,6 +2295,9 @@
       </w:r>
       <w:r>
         <w:t xml:space="preserve"> </w:t>
+      </w:r>
+      <w:r>
+        <w:t xml:space="preserve">(Smith and Kim 2006)</w:t>
       </w:r>
       <w:r>
         <w:t xml:space="preserve">, each item is dichotomized so that</w:t>
@@ -2271,6 +2358,9 @@
         <w:t xml:space="preserve"> </w:t>
       </w:r>
       <w:r>
+        <w:t xml:space="preserve">(Schatz et al. 1999)</w:t>
+      </w:r>
+      <w:r>
         <w:t xml:space="preserve">. It is computed as the mean of four items: (1)</w:t>
       </w:r>
       <w:r>
@@ -2472,6 +2562,9 @@
         <w:t xml:space="preserve"> </w:t>
       </w:r>
       <w:r>
+        <w:t xml:space="preserve">(Schatz et al. 1999)</w:t>
+      </w:r>
+      <w:r>
         <w:t xml:space="preserve">—closer to the construct that needs-based and authoritarian-personality accounts are theories of: a defensive, comparative worldview rooted in a chauvinistic sense of superiority, that satisfies psychological needs for certainty, belonging, and system justification, rather than an emotion generated by everyday experiences of autonomy and choice.</w:t>
       </w:r>
     </w:p>
@@ -2928,6 +3021,9 @@
         <w:t xml:space="preserve"> </w:t>
       </w:r>
       <w:r>
+        <w:t xml:space="preserve">(Jost et al. 2003)</w:t>
+      </w:r>
+      <w:r>
         <w:t xml:space="preserve">, the interaction between education and the survey year on the Nationalism scale is neither statistically nor substantively significant, suggesting no appreciable change in blind patriotism among these groups post 9/11. Accordingly, the need-based and irrational patriotism hypotheses fail to fully capture the changing dynamics of national attachment after 9/11, as the anticipated surge in blindly patriotic nationalism among the dispossessed did not neatly materialize as the primary driver of the 9/11 effect (Table</w:t>
       </w:r>
       <w:r>
@@ -3329,6 +3425,9 @@
         <w:t xml:space="preserve"> </w:t>
       </w:r>
       <w:r>
+        <w:t xml:space="preserve">(1992)</w:t>
+      </w:r>
+      <w:r>
         <w:t xml:space="preserve"> </w:t>
       </w:r>
       <w:r>
@@ -3388,6 +3487,9 @@
       </w:r>
       <w:r>
         <w:t xml:space="preserve"> </w:t>
+      </w:r>
+      <w:r>
+        <w:t xml:space="preserve">(1979)</w:t>
       </w:r>
       <w:r>
         <w:t xml:space="preserve"> </w:t>
@@ -3513,6 +3615,9 @@
         <w:t xml:space="preserve"> </w:t>
       </w:r>
       <w:r>
+        <w:t xml:space="preserve">(R Core Team 2024)</w:t>
+      </w:r>
+      <w:r>
         <w:t xml:space="preserve">, using the following packages:</w:t>
       </w:r>
       <w:r>
@@ -3528,6 +3633,9 @@
         <w:t xml:space="preserve"> </w:t>
       </w:r>
       <w:r>
+        <w:t xml:space="preserve">(Healy 2024)</w:t>
+      </w:r>
+      <w:r>
         <w:t xml:space="preserve"> </w:t>
       </w:r>
       <w:r>
@@ -3561,6 +3669,9 @@
         <w:t xml:space="preserve"> </w:t>
       </w:r>
       <w:r>
+        <w:t xml:space="preserve">(Wickham et al. 2023; Wickham and Vaughan 2023)</w:t>
+      </w:r>
+      <w:r>
         <w:t xml:space="preserve"> </w:t>
       </w:r>
       <w:r>
@@ -3579,6 +3690,9 @@
         <w:t xml:space="preserve"> </w:t>
       </w:r>
       <w:r>
+        <w:t xml:space="preserve">(Wickham 2016)</w:t>
+      </w:r>
+      <w:r>
         <w:t xml:space="preserve"> </w:t>
       </w:r>
       <w:r>
@@ -3595,6 +3709,9 @@
       </w:r>
       <w:r>
         <w:t xml:space="preserve"> </w:t>
+      </w:r>
+      <w:r>
+        <w:t xml:space="preserve">(Arel-Bundock 2024)</w:t>
       </w:r>
       <w:r>
         <w:t xml:space="preserve"> </w:t>
@@ -5200,833 +5317,8 @@
       </w:tr>
     </w:tbl>
     <w:bookmarkEnd w:id="47"/>
-    <w:p>
-      <w:pPr>
-        <w:pStyle w:val="BodyText"/>
-      </w:pPr>
-      <w:r>
-        <w:t xml:space="preserve"> </w:t>
-      </w:r>
-      <w:r>
-        <w:t xml:space="preserve">colspec=</w:t>
-      </w:r>
-      <w:r>
-        <w:t xml:space="preserve">Q[]Q[]Q[]</w:t>
-      </w:r>
-      <w:r>
-        <w:t xml:space="preserve">,</w:t>
-      </w:r>
-      <w:r>
-        <w:t xml:space="preserve"> </w:t>
-      </w:r>
-      <w:r>
-        <w:t xml:space="preserve">hline</w:t>
-      </w:r>
-      <w:r>
-        <w:t xml:space="preserve">2</w:t>
-      </w:r>
-      <w:r>
-        <w:t xml:space="preserve">=</w:t>
-      </w:r>
-      <w:r>
-        <w:t xml:space="preserve">1-3</w:t>
-      </w:r>
-      <w:r>
-        <w:t xml:space="preserve">solid, black, .05em</w:t>
-      </w:r>
-      <w:r>
-        <w:t xml:space="preserve">,</w:t>
-      </w:r>
-      <w:r>
-        <w:t xml:space="preserve"> </w:t>
-      </w:r>
-      <w:r>
-        <w:t xml:space="preserve">hline</w:t>
-      </w:r>
-      <w:r>
-        <w:t xml:space="preserve">12</w:t>
-      </w:r>
-      <w:r>
-        <w:t xml:space="preserve">=</w:t>
-      </w:r>
-      <w:r>
-        <w:t xml:space="preserve">1-3</w:t>
-      </w:r>
-      <w:r>
-        <w:t xml:space="preserve">solid, black, .05em</w:t>
-      </w:r>
-      <w:r>
-        <w:t xml:space="preserve">,</w:t>
-      </w:r>
-      <w:r>
-        <w:t xml:space="preserve"> </w:t>
-      </w:r>
-      <w:r>
-        <w:t xml:space="preserve">hline</w:t>
-      </w:r>
-      <w:r>
-        <w:t xml:space="preserve">1</w:t>
-      </w:r>
-      <w:r>
-        <w:t xml:space="preserve">=</w:t>
-      </w:r>
-      <w:r>
-        <w:t xml:space="preserve">1-3</w:t>
-      </w:r>
-      <w:r>
-        <w:t xml:space="preserve">solid, black, .08em</w:t>
-      </w:r>
-      <w:r>
-        <w:t xml:space="preserve">,</w:t>
-      </w:r>
-      <w:r>
-        <w:t xml:space="preserve"> </w:t>
-      </w:r>
-      <w:r>
-        <w:t xml:space="preserve">hline</w:t>
-      </w:r>
-      <w:r>
-        <w:t xml:space="preserve">19</w:t>
-      </w:r>
-      <w:r>
-        <w:t xml:space="preserve">=</w:t>
-      </w:r>
-      <w:r>
-        <w:t xml:space="preserve">1-3</w:t>
-      </w:r>
-      <w:r>
-        <w:t xml:space="preserve">solid, black, .08em</w:t>
-      </w:r>
-      <w:r>
-        <w:t xml:space="preserve">,</w:t>
-      </w:r>
-      <w:r>
-        <w:t xml:space="preserve"> </w:t>
-      </w:r>
-      <w:r>
-        <w:t xml:space="preserve">column</w:t>
-      </w:r>
-      <w:r>
-        <w:t xml:space="preserve">2-3</w:t>
-      </w:r>
-      <w:r>
-        <w:t xml:space="preserve">=</w:t>
-      </w:r>
-      <w:r>
-        <w:t xml:space="preserve">halign=c</w:t>
-      </w:r>
-      <w:r>
-        <w:t xml:space="preserve">,</w:t>
-      </w:r>
-      <w:r>
-        <w:t xml:space="preserve"> </w:t>
-      </w:r>
-      <w:r>
-        <w:t xml:space="preserve">column</w:t>
-      </w:r>
-      <w:r>
-        <w:t xml:space="preserve">1</w:t>
-      </w:r>
-      <w:r>
-        <w:t xml:space="preserve">=</w:t>
-      </w:r>
-      <w:r>
-        <w:t xml:space="preserve">halign=l</w:t>
-      </w:r>
-      <w:r>
-        <w:t xml:space="preserve">,</w:t>
-      </w:r>
-      <w:r>
-        <w:t xml:space="preserve"> </w:t>
-      </w:r>
-      <w:r>
-        <w:t xml:space="preserve"> </w:t>
-      </w:r>
-      <w:r>
-        <w:t xml:space="preserve">&amp; Base Change &amp; Educ Interaction</w:t>
-      </w:r>
-      <w:r>
-        <w:br/>
-      </w:r>
-      <w:r>
-        <w:t xml:space="preserve">Education (Years) &amp; &amp; −0.056***</w:t>
-      </w:r>
-      <w:r>
-        <w:br/>
-      </w:r>
-      <w:r>
-        <w:t xml:space="preserve">&amp; &amp; (0.007)</w:t>
-      </w:r>
-      <w:r>
-        <w:br/>
-      </w:r>
-      <w:r>
-        <w:t xml:space="preserve">Birth Cohort &amp; −0.010*** &amp; −0.009***</w:t>
-      </w:r>
-      <w:r>
-        <w:br/>
-      </w:r>
-      <w:r>
-        <w:t xml:space="preserve">&amp; (0.001) &amp; (0.001)</w:t>
-      </w:r>
-      <w:r>
-        <w:br/>
-      </w:r>
-      <w:r>
-        <w:t xml:space="preserve">Year: 2004 &amp; 0.132*** &amp; 0.159</w:t>
-      </w:r>
-      <w:r>
-        <w:br/>
-      </w:r>
-      <w:r>
-        <w:t xml:space="preserve">&amp; (0.028) &amp; (0.136)</w:t>
-      </w:r>
-      <w:r>
-        <w:br/>
-      </w:r>
-      <w:r>
-        <w:t xml:space="preserve">Education × Year 2004 &amp; &amp; −0.000</w:t>
-      </w:r>
-      <w:r>
-        <w:br/>
-      </w:r>
-      <w:r>
-        <w:t xml:space="preserve">&amp; &amp; (0.010)</w:t>
-      </w:r>
-      <w:r>
-        <w:br/>
-      </w:r>
-      <w:r>
-        <w:t xml:space="preserve">Intercept &amp; 22.361*** &amp; 21.818***</w:t>
-      </w:r>
-      <w:r>
-        <w:br/>
-      </w:r>
-      <w:r>
-        <w:t xml:space="preserve">&amp; (1.651) &amp; (1.612)</w:t>
-      </w:r>
-      <w:r>
-        <w:br/>
-      </w:r>
-      <w:r>
-        <w:t xml:space="preserve">Num.Obs. &amp; 2531 &amp; 2528</w:t>
-      </w:r>
-      <w:r>
-        <w:br/>
-      </w:r>
-      <w:r>
-        <w:t xml:space="preserve">R2 &amp; 0.050 &amp; 0.098</w:t>
-      </w:r>
-      <w:r>
-        <w:br/>
-      </w:r>
-      <w:r>
-        <w:t xml:space="preserve">R2 Adj. &amp; 0.050 &amp; 0.096</w:t>
-      </w:r>
-      <w:r>
-        <w:br/>
-      </w:r>
-      <w:r>
-        <w:t xml:space="preserve">AIC &amp; 5566.8 &amp; 5433.6</w:t>
-      </w:r>
-      <w:r>
-        <w:br/>
-      </w:r>
-      <w:r>
-        <w:t xml:space="preserve">BIC &amp; 5590.1 &amp; 5468.6</w:t>
-      </w:r>
-      <w:r>
-        <w:br/>
-      </w:r>
-      <w:r>
-        <w:t xml:space="preserve">Log.Lik. &amp; −2779.378 &amp; −2710.805</w:t>
-      </w:r>
-      <w:r>
-        <w:br/>
-      </w:r>
-      <w:r>
-        <w:t xml:space="preserve">RMSE &amp; 0.69 &amp; 0.67</w:t>
-      </w:r>
-      <w:r>
-        <w:br/>
-      </w:r>
-    </w:p>
-    <w:p>
-      <w:pPr>
-        <w:pStyle w:val="BodyText"/>
-      </w:pPr>
-      <w:r>
-        <w:t xml:space="preserve"> </w:t>
-      </w:r>
-      <w:r>
-        <w:t xml:space="preserve">colspec=</w:t>
-      </w:r>
-      <w:r>
-        <w:t xml:space="preserve">Q[]Q[]Q[]Q[]</w:t>
-      </w:r>
-      <w:r>
-        <w:t xml:space="preserve">,</w:t>
-      </w:r>
-      <w:r>
-        <w:t xml:space="preserve"> </w:t>
-      </w:r>
-      <w:r>
-        <w:t xml:space="preserve">hline</w:t>
-      </w:r>
-      <w:r>
-        <w:t xml:space="preserve">2</w:t>
-      </w:r>
-      <w:r>
-        <w:t xml:space="preserve">=</w:t>
-      </w:r>
-      <w:r>
-        <w:t xml:space="preserve">1-4</w:t>
-      </w:r>
-      <w:r>
-        <w:t xml:space="preserve">solid, black, .05em</w:t>
-      </w:r>
-      <w:r>
-        <w:t xml:space="preserve">,</w:t>
-      </w:r>
-      <w:r>
-        <w:t xml:space="preserve"> </w:t>
-      </w:r>
-      <w:r>
-        <w:t xml:space="preserve">hline</w:t>
-      </w:r>
-      <w:r>
-        <w:t xml:space="preserve">12</w:t>
-      </w:r>
-      <w:r>
-        <w:t xml:space="preserve">=</w:t>
-      </w:r>
-      <w:r>
-        <w:t xml:space="preserve">1-4</w:t>
-      </w:r>
-      <w:r>
-        <w:t xml:space="preserve">solid, black, .05em</w:t>
-      </w:r>
-      <w:r>
-        <w:t xml:space="preserve">,</w:t>
-      </w:r>
-      <w:r>
-        <w:t xml:space="preserve"> </w:t>
-      </w:r>
-      <w:r>
-        <w:t xml:space="preserve">hline</w:t>
-      </w:r>
-      <w:r>
-        <w:t xml:space="preserve">1</w:t>
-      </w:r>
-      <w:r>
-        <w:t xml:space="preserve">=</w:t>
-      </w:r>
-      <w:r>
-        <w:t xml:space="preserve">1-4</w:t>
-      </w:r>
-      <w:r>
-        <w:t xml:space="preserve">solid, black, .08em</w:t>
-      </w:r>
-      <w:r>
-        <w:t xml:space="preserve">,</w:t>
-      </w:r>
-      <w:r>
-        <w:t xml:space="preserve"> </w:t>
-      </w:r>
-      <w:r>
-        <w:t xml:space="preserve">hline</w:t>
-      </w:r>
-      <w:r>
-        <w:t xml:space="preserve">19</w:t>
-      </w:r>
-      <w:r>
-        <w:t xml:space="preserve">=</w:t>
-      </w:r>
-      <w:r>
-        <w:t xml:space="preserve">1-4</w:t>
-      </w:r>
-      <w:r>
-        <w:t xml:space="preserve">solid, black, .08em</w:t>
-      </w:r>
-      <w:r>
-        <w:t xml:space="preserve">,</w:t>
-      </w:r>
-      <w:r>
-        <w:t xml:space="preserve"> </w:t>
-      </w:r>
-      <w:r>
-        <w:t xml:space="preserve">column</w:t>
-      </w:r>
-      <w:r>
-        <w:t xml:space="preserve">2-4</w:t>
-      </w:r>
-      <w:r>
-        <w:t xml:space="preserve">=</w:t>
-      </w:r>
-      <w:r>
-        <w:t xml:space="preserve">halign=c</w:t>
-      </w:r>
-      <w:r>
-        <w:t xml:space="preserve">,</w:t>
-      </w:r>
-      <w:r>
-        <w:t xml:space="preserve"> </w:t>
-      </w:r>
-      <w:r>
-        <w:t xml:space="preserve">column</w:t>
-      </w:r>
-      <w:r>
-        <w:t xml:space="preserve">1</w:t>
-      </w:r>
-      <w:r>
-        <w:t xml:space="preserve">=</w:t>
-      </w:r>
-      <w:r>
-        <w:t xml:space="preserve">halign=l</w:t>
-      </w:r>
-      <w:r>
-        <w:t xml:space="preserve">,</w:t>
-      </w:r>
-      <w:r>
-        <w:t xml:space="preserve"> </w:t>
-      </w:r>
-      <w:r>
-        <w:t xml:space="preserve"> </w:t>
-      </w:r>
-      <w:r>
-        <w:t xml:space="preserve">&amp; 1996 &amp; 2004 &amp; Pooled Interaction</w:t>
-      </w:r>
-      <w:r>
-        <w:br/>
-      </w:r>
-      <w:r>
-        <w:t xml:space="preserve">Education (Years) &amp; −0.066* &amp; 0.040 &amp; −0.072*</w:t>
-      </w:r>
-      <w:r>
-        <w:br/>
-      </w:r>
-      <w:r>
-        <w:t xml:space="preserve">&amp; (0.030) &amp; (0.032) &amp; (0.030)</w:t>
-      </w:r>
-      <w:r>
-        <w:br/>
-      </w:r>
-      <w:r>
-        <w:t xml:space="preserve">Birth Cohort &amp; −0.047*** &amp; −0.028*** &amp; −0.038***</w:t>
-      </w:r>
-      <w:r>
-        <w:br/>
-      </w:r>
-      <w:r>
-        <w:t xml:space="preserve">&amp; (0.005) &amp; (0.005) &amp; (0.004)</w:t>
-      </w:r>
-      <w:r>
-        <w:br/>
-      </w:r>
-      <w:r>
-        <w:t xml:space="preserve">Year: 2004 &amp; &amp; &amp; −0.343</w:t>
-      </w:r>
-      <w:r>
-        <w:br/>
-      </w:r>
-      <w:r>
-        <w:t xml:space="preserve">&amp; &amp; &amp; (0.624)</w:t>
-      </w:r>
-      <w:r>
-        <w:br/>
-      </w:r>
-      <w:r>
-        <w:t xml:space="preserve">Education × Year 2004 &amp; &amp; &amp; 0.114**</w:t>
-      </w:r>
-      <w:r>
-        <w:br/>
-      </w:r>
-      <w:r>
-        <w:t xml:space="preserve">&amp; &amp; &amp; (0.044)</w:t>
-      </w:r>
-      <w:r>
-        <w:br/>
-      </w:r>
-      <w:r>
-        <w:t xml:space="preserve">Intercept &amp; 96.569*** &amp; 59.411*** &amp; 79.100***</w:t>
-      </w:r>
-      <w:r>
-        <w:br/>
-      </w:r>
-      <w:r>
-        <w:t xml:space="preserve">&amp; (10.017) &amp; (10.314) &amp; (7.183)</w:t>
-      </w:r>
-      <w:r>
-        <w:br/>
-      </w:r>
-      <w:r>
-        <w:t xml:space="preserve">Num.Obs. &amp; 1066 &amp; 975 &amp; 2041</w:t>
-      </w:r>
-      <w:r>
-        <w:br/>
-      </w:r>
-      <w:r>
-        <w:t xml:space="preserve">R2 &amp; 0.081 &amp; 0.030 &amp; 0.084</w:t>
-      </w:r>
-      <w:r>
-        <w:br/>
-      </w:r>
-      <w:r>
-        <w:t xml:space="preserve">R2 Adj. &amp; 0.080 &amp; 0.028 &amp; 0.083</w:t>
-      </w:r>
-      <w:r>
-        <w:br/>
-      </w:r>
-      <w:r>
-        <w:t xml:space="preserve">AIC &amp; 5239.6 &amp; 4778.3 &amp; 10021.1</w:t>
-      </w:r>
-      <w:r>
-        <w:br/>
-      </w:r>
-      <w:r>
-        <w:t xml:space="preserve">BIC &amp; 5259.4 &amp; 4797.8 &amp; 10054.8</w:t>
-      </w:r>
-      <w:r>
-        <w:br/>
-      </w:r>
-      <w:r>
-        <w:t xml:space="preserve">Log.Lik. &amp; −2615.781 &amp; −2385.153 &amp; −5004.531</w:t>
-      </w:r>
-      <w:r>
-        <w:br/>
-      </w:r>
-      <w:r>
-        <w:t xml:space="preserve">RMSE &amp; 2.73 &amp; 2.60 &amp; 2.67</w:t>
-      </w:r>
-      <w:r>
-        <w:br/>
-      </w:r>
-    </w:p>
-    <w:p>
-      <w:pPr>
-        <w:pStyle w:val="BodyText"/>
-      </w:pPr>
-      <w:r>
-        <w:t xml:space="preserve"> </w:t>
-      </w:r>
-      <w:r>
-        <w:t xml:space="preserve">colspec=</w:t>
-      </w:r>
-      <w:r>
-        <w:t xml:space="preserve">Q[]Q[]Q[]Q[]Q[]</w:t>
-      </w:r>
-      <w:r>
-        <w:t xml:space="preserve">,</w:t>
-      </w:r>
-      <w:r>
-        <w:t xml:space="preserve"> </w:t>
-      </w:r>
-      <w:r>
-        <w:t xml:space="preserve">hline</w:t>
-      </w:r>
-      <w:r>
-        <w:t xml:space="preserve">2</w:t>
-      </w:r>
-      <w:r>
-        <w:t xml:space="preserve">=</w:t>
-      </w:r>
-      <w:r>
-        <w:t xml:space="preserve">1-5</w:t>
-      </w:r>
-      <w:r>
-        <w:t xml:space="preserve">solid, black, .05em</w:t>
-      </w:r>
-      <w:r>
-        <w:t xml:space="preserve">,</w:t>
-      </w:r>
-      <w:r>
-        <w:t xml:space="preserve"> </w:t>
-      </w:r>
-      <w:r>
-        <w:t xml:space="preserve">hline</w:t>
-      </w:r>
-      <w:r>
-        <w:t xml:space="preserve">24</w:t>
-      </w:r>
-      <w:r>
-        <w:t xml:space="preserve">=</w:t>
-      </w:r>
-      <w:r>
-        <w:t xml:space="preserve">1-5</w:t>
-      </w:r>
-      <w:r>
-        <w:t xml:space="preserve">solid, black, .05em</w:t>
-      </w:r>
-      <w:r>
-        <w:t xml:space="preserve">,</w:t>
-      </w:r>
-      <w:r>
-        <w:t xml:space="preserve"> </w:t>
-      </w:r>
-      <w:r>
-        <w:t xml:space="preserve">hline</w:t>
-      </w:r>
-      <w:r>
-        <w:t xml:space="preserve">1</w:t>
-      </w:r>
-      <w:r>
-        <w:t xml:space="preserve">=</w:t>
-      </w:r>
-      <w:r>
-        <w:t xml:space="preserve">1-5</w:t>
-      </w:r>
-      <w:r>
-        <w:t xml:space="preserve">solid, black, .08em</w:t>
-      </w:r>
-      <w:r>
-        <w:t xml:space="preserve">,</w:t>
-      </w:r>
-      <w:r>
-        <w:t xml:space="preserve"> </w:t>
-      </w:r>
-      <w:r>
-        <w:t xml:space="preserve">hline</w:t>
-      </w:r>
-      <w:r>
-        <w:t xml:space="preserve">31</w:t>
-      </w:r>
-      <w:r>
-        <w:t xml:space="preserve">=</w:t>
-      </w:r>
-      <w:r>
-        <w:t xml:space="preserve">1-5</w:t>
-      </w:r>
-      <w:r>
-        <w:t xml:space="preserve">solid, black, .08em</w:t>
-      </w:r>
-      <w:r>
-        <w:t xml:space="preserve">,</w:t>
-      </w:r>
-      <w:r>
-        <w:t xml:space="preserve"> </w:t>
-      </w:r>
-      <w:r>
-        <w:t xml:space="preserve">column</w:t>
-      </w:r>
-      <w:r>
-        <w:t xml:space="preserve">2-5</w:t>
-      </w:r>
-      <w:r>
-        <w:t xml:space="preserve">=</w:t>
-      </w:r>
-      <w:r>
-        <w:t xml:space="preserve">halign=c</w:t>
-      </w:r>
-      <w:r>
-        <w:t xml:space="preserve">,</w:t>
-      </w:r>
-      <w:r>
-        <w:t xml:space="preserve"> </w:t>
-      </w:r>
-      <w:r>
-        <w:t xml:space="preserve">column</w:t>
-      </w:r>
-      <w:r>
-        <w:t xml:space="preserve">1</w:t>
-      </w:r>
-      <w:r>
-        <w:t xml:space="preserve">=</w:t>
-      </w:r>
-      <w:r>
-        <w:t xml:space="preserve">halign=l</w:t>
-      </w:r>
-      <w:r>
-        <w:t xml:space="preserve">,</w:t>
-      </w:r>
-      <w:r>
-        <w:t xml:space="preserve"> </w:t>
-      </w:r>
-      <w:r>
-        <w:t xml:space="preserve"> </w:t>
-      </w:r>
-      <w:r>
-        <w:t xml:space="preserve">&amp; Demographics &amp; Mem (Cat) &amp; Mem (Count) &amp; Full (+ Nat)</w:t>
-      </w:r>
-      <w:r>
-        <w:br/>
-      </w:r>
-      <w:r>
-        <w:t xml:space="preserve">Education (Years) &amp; 0.017 &amp; −0.010 &amp; −0.007 &amp; 0.059+</w:t>
-      </w:r>
-      <w:r>
-        <w:br/>
-      </w:r>
-      <w:r>
-        <w:t xml:space="preserve">&amp; (0.032) &amp; (0.033) &amp; (0.033) &amp; (0.032)</w:t>
-      </w:r>
-      <w:r>
-        <w:br/>
-      </w:r>
-      <w:r>
-        <w:t xml:space="preserve">Birth Cohort &amp; −0.025*** &amp; −0.024*** &amp; −0.024*** &amp; −0.016**</w:t>
-      </w:r>
-      <w:r>
-        <w:br/>
-      </w:r>
-      <w:r>
-        <w:t xml:space="preserve">&amp; (0.005) &amp; (0.005) &amp; (0.005) &amp; (0.005)</w:t>
-      </w:r>
-      <w:r>
-        <w:br/>
-      </w:r>
-      <w:r>
-        <w:t xml:space="preserve">Female &amp; −0.706*** &amp; −0.677*** &amp; −0.679*** &amp; −0.583***</w:t>
-      </w:r>
-      <w:r>
-        <w:br/>
-      </w:r>
-      <w:r>
-        <w:t xml:space="preserve">&amp; (0.167) &amp; (0.167) &amp; (0.167) &amp; (0.160)</w:t>
-      </w:r>
-      <w:r>
-        <w:br/>
-      </w:r>
-      <w:r>
-        <w:t xml:space="preserve">Race: Black &amp; −1.331*** &amp; −1.355*** &amp; −1.373*** &amp; −1.165***</w:t>
-      </w:r>
-      <w:r>
-        <w:br/>
-      </w:r>
-      <w:r>
-        <w:t xml:space="preserve">&amp; (0.260) &amp; (0.260) &amp; (0.261) &amp; (0.250)</w:t>
-      </w:r>
-      <w:r>
-        <w:br/>
-      </w:r>
-      <w:r>
-        <w:t xml:space="preserve">Race: Other &amp; −0.087 &amp; −0.036 &amp; −0.060 &amp; −0.064</w:t>
-      </w:r>
-      <w:r>
-        <w:br/>
-      </w:r>
-      <w:r>
-        <w:t xml:space="preserve">&amp; (0.339) &amp; (0.339) &amp; (0.339) &amp; (0.324)</w:t>
-      </w:r>
-      <w:r>
-        <w:br/>
-      </w:r>
-      <w:r>
-        <w:t xml:space="preserve">Region: South &amp; 0.256 &amp; 0.250 &amp; 0.252 &amp; 0.146</w:t>
-      </w:r>
-      <w:r>
-        <w:br/>
-      </w:r>
-      <w:r>
-        <w:t xml:space="preserve">&amp; (0.177) &amp; (0.177) &amp; (0.177) &amp; (0.170)</w:t>
-      </w:r>
-      <w:r>
-        <w:br/>
-      </w:r>
-      <w:r>
-        <w:t xml:space="preserve">Nationalist Scale &amp; &amp; &amp; &amp; 1.164***</w:t>
-      </w:r>
-      <w:r>
-        <w:br/>
-      </w:r>
-      <w:r>
-        <w:t xml:space="preserve">&amp; &amp; &amp; &amp; (0.122)</w:t>
-      </w:r>
-      <w:r>
-        <w:br/>
-      </w:r>
-      <w:r>
-        <w:t xml:space="preserve">Total Memberships (Count) &amp; &amp; &amp; 0.115* &amp; 0.112**</w:t>
-      </w:r>
-      <w:r>
-        <w:br/>
-      </w:r>
-      <w:r>
-        <w:t xml:space="preserve">&amp; &amp; &amp; (0.045) &amp; (0.043)</w:t>
-      </w:r>
-      <w:r>
-        <w:br/>
-      </w:r>
-      <w:r>
-        <w:t xml:space="preserve">Memberships: 1-2 &amp; &amp; 0.406* &amp; &amp;</w:t>
-      </w:r>
-      <w:r>
-        <w:br/>
-      </w:r>
-      <w:r>
-        <w:t xml:space="preserve">&amp; &amp; (0.199) &amp; &amp;</w:t>
-      </w:r>
-      <w:r>
-        <w:br/>
-      </w:r>
-      <w:r>
-        <w:t xml:space="preserve">Memberships: 3+ &amp; &amp; 0.680** &amp; &amp;</w:t>
-      </w:r>
-      <w:r>
-        <w:br/>
-      </w:r>
-      <w:r>
-        <w:t xml:space="preserve">&amp; &amp; (0.221) &amp; &amp;</w:t>
-      </w:r>
-      <w:r>
-        <w:br/>
-      </w:r>
-      <w:r>
-        <w:t xml:space="preserve">Intercept &amp; 53.833*** &amp; 51.190*** &amp; 51.826*** &amp; 31.206**</w:t>
-      </w:r>
-      <w:r>
-        <w:br/>
-      </w:r>
-      <w:r>
-        <w:t xml:space="preserve">&amp; (10.188) &amp; (10.200) &amp; (10.204) &amp; (9.992)</w:t>
-      </w:r>
-      <w:r>
-        <w:br/>
-      </w:r>
-      <w:r>
-        <w:t xml:space="preserve">Num.Obs. &amp; 975 &amp; 974 &amp; 974 &amp; 974</w:t>
-      </w:r>
-      <w:r>
-        <w:br/>
-      </w:r>
-      <w:r>
-        <w:t xml:space="preserve">R2 &amp; 0.071 &amp; 0.081 &amp; 0.077 &amp; 0.157</w:t>
-      </w:r>
-      <w:r>
-        <w:br/>
-      </w:r>
-      <w:r>
-        <w:t xml:space="preserve">R2 Adj. &amp; 0.066 &amp; 0.073 &amp; 0.071 &amp; 0.150</w:t>
-      </w:r>
-      <w:r>
-        <w:br/>
-      </w:r>
-      <w:r>
-        <w:t xml:space="preserve">AIC &amp; 4743.7 &amp; 4735.3 &amp; 4736.6 &amp; 4650.3</w:t>
-      </w:r>
-      <w:r>
-        <w:br/>
-      </w:r>
-      <w:r>
-        <w:t xml:space="preserve">BIC &amp; 4782.8 &amp; 4784.1 &amp; 4780.5 &amp; 4699.1</w:t>
-      </w:r>
-      <w:r>
-        <w:br/>
-      </w:r>
-      <w:r>
-        <w:t xml:space="preserve">Log.Lik. &amp; −2363.873 &amp; −2357.626 &amp; −2359.299 &amp; −2315.136</w:t>
-      </w:r>
-      <w:r>
-        <w:br/>
-      </w:r>
-      <w:r>
-        <w:t xml:space="preserve">RMSE &amp; 2.56 &amp; 2.55 &amp; 2.55 &amp; 2.41</w:t>
-      </w:r>
-      <w:r>
-        <w:br/>
-      </w:r>
-    </w:p>
     <w:bookmarkEnd w:id="48"/>
-    <w:bookmarkStart w:id="65" w:name="figures"/>
+    <w:bookmarkStart w:id="49" w:name="figures"/>
     <w:p>
       <w:pPr>
         <w:pStyle w:val="Heading1"/>
@@ -6035,28 +5327,38 @@
         <w:t xml:space="preserve">Figures</w:t>
       </w:r>
     </w:p>
+    <w:bookmarkEnd w:id="49"/>
+    <w:bookmarkStart w:id="131" w:name="figures-1"/>
+    <w:p>
+      <w:pPr>
+        <w:pStyle w:val="Heading1"/>
+      </w:pPr>
+      <w:r>
+        <w:t xml:space="preserve">Figures</w:t>
+      </w:r>
+    </w:p>
     <w:p>
       <w:pPr>
         <w:pStyle w:val="CaptionedFigure"/>
       </w:pPr>
-      <w:bookmarkStart w:id="52" w:name="fig:logistic_pride"/>
+      <w:bookmarkStart w:id="53" w:name="fig:logistic_pride"/>
       <w:r>
         <w:drawing>
           <wp:inline>
             <wp:extent cx="5334000" cy="3810000"/>
             <wp:effectExtent b="0" l="0" r="0" t="0"/>
-            <wp:docPr descr="Increase in Likelihood of Being ‘Very Proud’ Post-9/11 (Odds Ratios)" title="" id="50" name="Picture"/>
+            <wp:docPr descr="Increase in Likelihood of Being ‘Very Proud’ Post-9/11 (Odds Ratios)" title="" id="51" name="Picture"/>
             <a:graphic>
               <a:graphicData uri="http://schemas.openxmlformats.org/drawingml/2006/picture">
                 <pic:pic>
                   <pic:nvPicPr>
-                    <pic:cNvPr descr="Plots/fig-logistic-pride.pdf" id="51" name="Picture"/>
+                    <pic:cNvPr descr="./fig-logistic-pride.pdf" id="52" name="Picture"/>
                     <pic:cNvPicPr>
                       <a:picLocks noChangeArrowheads="1" noChangeAspect="1"/>
                     </pic:cNvPicPr>
                   </pic:nvPicPr>
                   <pic:blipFill>
-                    <a:blip r:embed="rId49"/>
+                    <a:blip r:embed="rId50"/>
                     <a:stretch>
                       <a:fillRect/>
                     </a:stretch>
@@ -6082,7 +5384,7 @@
           </wp:inline>
         </w:drawing>
       </w:r>
-      <w:bookmarkEnd w:id="52"/>
+      <w:bookmarkEnd w:id="53"/>
     </w:p>
     <w:p>
       <w:pPr>
@@ -6114,24 +5416,24 @@
       <w:pPr>
         <w:pStyle w:val="CaptionedFigure"/>
       </w:pPr>
-      <w:bookmarkStart w:id="56" w:name="fig:pride_bar"/>
+      <w:bookmarkStart w:id="57" w:name="fig:pride_bar"/>
       <w:r>
         <w:drawing>
           <wp:inline>
             <wp:extent cx="5334000" cy="3556000"/>
             <wp:effectExtent b="0" l="0" r="0" t="0"/>
-            <wp:docPr descr="Distribution of U.S. Pride Scale Scores (1996 vs. 2004)" title="" id="54" name="Picture"/>
+            <wp:docPr descr="Distribution of U.S. Pride Scale Scores (1996 vs. 2004)" title="" id="55" name="Picture"/>
             <a:graphic>
               <a:graphicData uri="http://schemas.openxmlformats.org/drawingml/2006/picture">
                 <pic:pic>
                   <pic:nvPicPr>
-                    <pic:cNvPr descr="Plots/fig-pride-bar.pdf" id="55" name="Picture"/>
+                    <pic:cNvPr descr="./fig-pride-bar.pdf" id="56" name="Picture"/>
                     <pic:cNvPicPr>
                       <a:picLocks noChangeArrowheads="1" noChangeAspect="1"/>
                     </pic:cNvPicPr>
                   </pic:nvPicPr>
                   <pic:blipFill>
-                    <a:blip r:embed="rId53"/>
+                    <a:blip r:embed="rId54"/>
                     <a:stretch>
                       <a:fillRect/>
                     </a:stretch>
@@ -6157,7 +5459,7 @@
           </wp:inline>
         </w:drawing>
       </w:r>
-      <w:bookmarkEnd w:id="56"/>
+      <w:bookmarkEnd w:id="57"/>
     </w:p>
     <w:p>
       <w:pPr>
@@ -6171,24 +5473,24 @@
       <w:pPr>
         <w:pStyle w:val="CaptionedFigure"/>
       </w:pPr>
-      <w:bookmarkStart w:id="60" w:name="fig:marginal_educ"/>
+      <w:bookmarkStart w:id="61" w:name="fig:marginal_educ"/>
       <w:r>
         <w:drawing>
           <wp:inline>
             <wp:extent cx="5334000" cy="3556000"/>
             <wp:effectExtent b="0" l="0" r="0" t="0"/>
-            <wp:docPr descr="Predicted U.S. Pride Score across Education Levels by Year" title="" id="58" name="Picture"/>
+            <wp:docPr descr="Predicted U.S. Pride Score across Education Levels by Year" title="" id="59" name="Picture"/>
             <a:graphic>
               <a:graphicData uri="http://schemas.openxmlformats.org/drawingml/2006/picture">
                 <pic:pic>
                   <pic:nvPicPr>
-                    <pic:cNvPr descr="Plots/fig-marginal-educ.pdf" id="59" name="Picture"/>
+                    <pic:cNvPr descr="./fig-marginal-educ.pdf" id="60" name="Picture"/>
                     <pic:cNvPicPr>
                       <a:picLocks noChangeArrowheads="1" noChangeAspect="1"/>
                     </pic:cNvPicPr>
                   </pic:nvPicPr>
                   <pic:blipFill>
-                    <a:blip r:embed="rId57"/>
+                    <a:blip r:embed="rId58"/>
                     <a:stretch>
                       <a:fillRect/>
                     </a:stretch>
@@ -6214,7 +5516,7 @@
           </wp:inline>
         </w:drawing>
       </w:r>
-      <w:bookmarkEnd w:id="60"/>
+      <w:bookmarkEnd w:id="61"/>
     </w:p>
     <w:p>
       <w:pPr>
@@ -6228,24 +5530,24 @@
       <w:pPr>
         <w:pStyle w:val="CaptionedFigure"/>
       </w:pPr>
-      <w:bookmarkStart w:id="64" w:name="fig:membership_forest"/>
+      <w:bookmarkStart w:id="65" w:name="fig:membership_forest"/>
       <w:r>
         <w:drawing>
           <wp:inline>
             <wp:extent cx="5334000" cy="4572000"/>
             <wp:effectExtent b="0" l="0" r="0" t="0"/>
-            <wp:docPr descr="Effect of Specific Association Memberships on U.S. Pride (Controlling for Cohort)" title="" id="62" name="Picture"/>
+            <wp:docPr descr="Effect of Specific Association Memberships on U.S. Pride (Controlling for Cohort)" title="" id="63" name="Picture"/>
             <a:graphic>
               <a:graphicData uri="http://schemas.openxmlformats.org/drawingml/2006/picture">
                 <pic:pic>
                   <pic:nvPicPr>
-                    <pic:cNvPr descr="Plots/fig-membership-forest.pdf" id="63" name="Picture"/>
+                    <pic:cNvPr descr="./fig-membership-forest.pdf" id="64" name="Picture"/>
                     <pic:cNvPicPr>
                       <a:picLocks noChangeArrowheads="1" noChangeAspect="1"/>
                     </pic:cNvPicPr>
                   </pic:nvPicPr>
                   <pic:blipFill>
-                    <a:blip r:embed="rId61"/>
+                    <a:blip r:embed="rId62"/>
                     <a:stretch>
                       <a:fillRect/>
                     </a:stretch>
@@ -6271,7 +5573,7 @@
           </wp:inline>
         </w:drawing>
       </w:r>
-      <w:bookmarkEnd w:id="64"/>
+      <w:bookmarkEnd w:id="65"/>
     </w:p>
     <w:p>
       <w:pPr>
@@ -6281,7 +5583,1439 @@
         <w:t xml:space="preserve">Effect of Specific Association Memberships on U.S. Pride (Controlling for Cohort)</w:t>
       </w:r>
     </w:p>
-    <w:bookmarkEnd w:id="65"/>
+    <w:bookmarkStart w:id="130" w:name="refs"/>
+    <w:bookmarkStart w:id="67" w:name="ref-adorno1950authoritarian-a52"/>
+    <w:p>
+      <w:pPr>
+        <w:pStyle w:val="Bibliography"/>
+      </w:pPr>
+      <w:r>
+        <w:t xml:space="preserve">Adorno, Theodor W., Betty Aron, Else Frenkel-Brunswik, Daniel J. Levinson, William Morrow, Maria Hertz Levinson, and R. Nevitt Sanford. 1950.</w:t>
+      </w:r>
+      <w:r>
+        <w:t xml:space="preserve"> </w:t>
+      </w:r>
+      <w:hyperlink r:id="rId66">
+        <w:r>
+          <w:rPr>
+            <w:rStyle w:val="Hyperlink"/>
+            <w:iCs/>
+            <w:i/>
+          </w:rPr>
+          <w:t xml:space="preserve">The Authoritarian Personality</w:t>
+        </w:r>
+      </w:hyperlink>
+      <w:r>
+        <w:t xml:space="preserve">. Harper.</w:t>
+      </w:r>
+    </w:p>
+    <w:bookmarkEnd w:id="67"/>
+    <w:bookmarkStart w:id="68" w:name="ref-anderson1991imagined-c99"/>
+    <w:p>
+      <w:pPr>
+        <w:pStyle w:val="Bibliography"/>
+      </w:pPr>
+      <w:r>
+        <w:t xml:space="preserve">Anderson, Benedict. 1991.</w:t>
+      </w:r>
+      <w:r>
+        <w:t xml:space="preserve"> </w:t>
+      </w:r>
+      <w:r>
+        <w:rPr>
+          <w:iCs/>
+          <w:i/>
+        </w:rPr>
+        <w:t xml:space="preserve">Imagined Communities: Reflections on the Origin and Spread of Nationalism</w:t>
+      </w:r>
+      <w:r>
+        <w:t xml:space="preserve">. London: Verso.</w:t>
+      </w:r>
+    </w:p>
+    <w:bookmarkEnd w:id="68"/>
+    <w:bookmarkStart w:id="70" w:name="ref-arel-bundock2024modelsummary"/>
+    <w:p>
+      <w:pPr>
+        <w:pStyle w:val="Bibliography"/>
+      </w:pPr>
+      <w:r>
+        <w:t xml:space="preserve">Arel-Bundock, Vincent. 2024.</w:t>
+      </w:r>
+      <w:r>
+        <w:t xml:space="preserve"> </w:t>
+      </w:r>
+      <w:hyperlink r:id="rId69">
+        <w:r>
+          <w:rPr>
+            <w:rStyle w:val="Hyperlink"/>
+            <w:iCs/>
+            <w:i/>
+          </w:rPr>
+          <w:t xml:space="preserve">Modelsummary: Summary Tables and Plots for Statistical Models and Data: Beautiful, Customizable, and Publication-Ready</w:t>
+        </w:r>
+      </w:hyperlink>
+      <w:r>
+        <w:t xml:space="preserve">.</w:t>
+      </w:r>
+    </w:p>
+    <w:bookmarkEnd w:id="70"/>
+    <w:bookmarkStart w:id="71" w:name="ref-bell1956social"/>
+    <w:p>
+      <w:pPr>
+        <w:pStyle w:val="Bibliography"/>
+      </w:pPr>
+      <w:r>
+        <w:t xml:space="preserve">Bell, Wendell, and Maryanne T. Force. 1956.</w:t>
+      </w:r>
+      <w:r>
+        <w:t xml:space="preserve"> </w:t>
+      </w:r>
+      <w:r>
+        <w:t xml:space="preserve">“Social Structure and Participation in Different Types of Formal Associations.”</w:t>
+      </w:r>
+      <w:r>
+        <w:t xml:space="preserve"> </w:t>
+      </w:r>
+      <w:r>
+        <w:rPr>
+          <w:iCs/>
+          <w:i/>
+        </w:rPr>
+        <w:t xml:space="preserve">Social Forces</w:t>
+      </w:r>
+      <w:r>
+        <w:t xml:space="preserve"> </w:t>
+      </w:r>
+      <w:r>
+        <w:t xml:space="preserve">34:345–50.</w:t>
+      </w:r>
+    </w:p>
+    <w:bookmarkEnd w:id="71"/>
+    <w:bookmarkStart w:id="72" w:name="ref-collins1986weberian"/>
+    <w:p>
+      <w:pPr>
+        <w:pStyle w:val="Bibliography"/>
+      </w:pPr>
+      <w:r>
+        <w:t xml:space="preserve">Collins, Randall. 1986.</w:t>
+      </w:r>
+      <w:r>
+        <w:t xml:space="preserve"> </w:t>
+      </w:r>
+      <w:r>
+        <w:rPr>
+          <w:iCs/>
+          <w:i/>
+        </w:rPr>
+        <w:t xml:space="preserve">Weberian Sociological Theory</w:t>
+      </w:r>
+      <w:r>
+        <w:t xml:space="preserve">. Cambridge University Press.</w:t>
+      </w:r>
+    </w:p>
+    <w:bookmarkEnd w:id="72"/>
+    <w:bookmarkStart w:id="73" w:name="ref-collins2004rituals"/>
+    <w:p>
+      <w:pPr>
+        <w:pStyle w:val="Bibliography"/>
+      </w:pPr>
+      <w:r>
+        <w:t xml:space="preserve">Collins, Randall. 2004.</w:t>
+      </w:r>
+      <w:r>
+        <w:t xml:space="preserve"> </w:t>
+      </w:r>
+      <w:r>
+        <w:t xml:space="preserve">“Rituals of Solidarity and Security in the Wake of Terrorist Attack.”</w:t>
+      </w:r>
+      <w:r>
+        <w:t xml:space="preserve"> </w:t>
+      </w:r>
+      <w:r>
+        <w:rPr>
+          <w:iCs/>
+          <w:i/>
+        </w:rPr>
+        <w:t xml:space="preserve">Sociological Theory</w:t>
+      </w:r>
+      <w:r>
+        <w:t xml:space="preserve"> </w:t>
+      </w:r>
+      <w:r>
+        <w:t xml:space="preserve">22(1):53–87.</w:t>
+      </w:r>
+    </w:p>
+    <w:bookmarkEnd w:id="73"/>
+    <w:bookmarkStart w:id="75" w:name="ref-dederichs2024join-411"/>
+    <w:p>
+      <w:pPr>
+        <w:pStyle w:val="Bibliography"/>
+      </w:pPr>
+      <w:r>
+        <w:t xml:space="preserve">Dederichs, Kasimir. 2024.</w:t>
+      </w:r>
+      <w:r>
+        <w:t xml:space="preserve"> </w:t>
+      </w:r>
+      <w:r>
+        <w:t xml:space="preserve">“Join to Connect? Voluntary Involvement, Social Capital, and Socioeconomic Inequalities.”</w:t>
+      </w:r>
+      <w:r>
+        <w:t xml:space="preserve"> </w:t>
+      </w:r>
+      <w:r>
+        <w:rPr>
+          <w:iCs/>
+          <w:i/>
+        </w:rPr>
+        <w:t xml:space="preserve">Social Networks</w:t>
+      </w:r>
+      <w:r>
+        <w:t xml:space="preserve"> </w:t>
+      </w:r>
+      <w:r>
+        <w:t xml:space="preserve">76:42–50. doi:</w:t>
+      </w:r>
+      <w:hyperlink r:id="rId74">
+        <w:r>
+          <w:rPr>
+            <w:rStyle w:val="Hyperlink"/>
+          </w:rPr>
+          <w:t xml:space="preserve">10.1016/j.socnet.2023.07.004</w:t>
+        </w:r>
+      </w:hyperlink>
+      <w:r>
+        <w:t xml:space="preserve">.</w:t>
+      </w:r>
+    </w:p>
+    <w:bookmarkEnd w:id="75"/>
+    <w:bookmarkStart w:id="76" w:name="ref-fine2021hinge"/>
+    <w:p>
+      <w:pPr>
+        <w:pStyle w:val="Bibliography"/>
+      </w:pPr>
+      <w:r>
+        <w:t xml:space="preserve">Fine, Gary Alan. 2021.</w:t>
+      </w:r>
+      <w:r>
+        <w:t xml:space="preserve"> </w:t>
+      </w:r>
+      <w:r>
+        <w:rPr>
+          <w:iCs/>
+          <w:i/>
+        </w:rPr>
+        <w:t xml:space="preserve">The Hinge: Civil Society, Group Cultures, and the Power of Local Commitments</w:t>
+      </w:r>
+      <w:r>
+        <w:t xml:space="preserve">. Chicago, IL: University of Chicago Press.</w:t>
+      </w:r>
+    </w:p>
+    <w:bookmarkEnd w:id="76"/>
+    <w:bookmarkStart w:id="77" w:name="ref-freeman1957correlates"/>
+    <w:p>
+      <w:pPr>
+        <w:pStyle w:val="Bibliography"/>
+      </w:pPr>
+      <w:r>
+        <w:t xml:space="preserve">Freeman, Howard E., Edwin Novak, and Leo G. Reeder. 1957.</w:t>
+      </w:r>
+      <w:r>
+        <w:t xml:space="preserve"> </w:t>
+      </w:r>
+      <w:r>
+        <w:t xml:space="preserve">“Correlates of Membership in Voluntary Associations.”</w:t>
+      </w:r>
+      <w:r>
+        <w:t xml:space="preserve"> </w:t>
+      </w:r>
+      <w:r>
+        <w:rPr>
+          <w:iCs/>
+          <w:i/>
+        </w:rPr>
+        <w:t xml:space="preserve">American Sociological Review</w:t>
+      </w:r>
+      <w:r>
+        <w:t xml:space="preserve"> </w:t>
+      </w:r>
+      <w:r>
+        <w:t xml:space="preserve">22:528–33.</w:t>
+      </w:r>
+    </w:p>
+    <w:bookmarkEnd w:id="77"/>
+    <w:bookmarkStart w:id="78" w:name="ref-giddens1984constitution"/>
+    <w:p>
+      <w:pPr>
+        <w:pStyle w:val="Bibliography"/>
+      </w:pPr>
+      <w:r>
+        <w:t xml:space="preserve">Giddens, Anthony. 1984.</w:t>
+      </w:r>
+      <w:r>
+        <w:t xml:space="preserve"> </w:t>
+      </w:r>
+      <w:r>
+        <w:rPr>
+          <w:iCs/>
+          <w:i/>
+        </w:rPr>
+        <w:t xml:space="preserve">The Constitution of Society: Outline of the Theory of Structuration</w:t>
+      </w:r>
+      <w:r>
+        <w:t xml:space="preserve">. Polity Press.</w:t>
+      </w:r>
+    </w:p>
+    <w:bookmarkEnd w:id="78"/>
+    <w:bookmarkStart w:id="80" w:name="ref-healy2024gssr"/>
+    <w:p>
+      <w:pPr>
+        <w:pStyle w:val="Bibliography"/>
+      </w:pPr>
+      <w:r>
+        <w:t xml:space="preserve">Healy, Kieran. 2024.</w:t>
+      </w:r>
+      <w:r>
+        <w:t xml:space="preserve"> </w:t>
+      </w:r>
+      <w:hyperlink r:id="rId79">
+        <w:r>
+          <w:rPr>
+            <w:rStyle w:val="Hyperlink"/>
+            <w:iCs/>
+            <w:i/>
+          </w:rPr>
+          <w:t xml:space="preserve">Gssr: General Social Survey Data from</w:t>
+        </w:r>
+        <w:r>
+          <w:rPr>
+            <w:rStyle w:val="Hyperlink"/>
+            <w:iCs/>
+            <w:i/>
+          </w:rPr>
+          <w:t xml:space="preserve"> </w:t>
+        </w:r>
+        <w:r>
+          <w:rPr>
+            <w:rStyle w:val="Hyperlink"/>
+            <w:iCs/>
+            <w:i/>
+          </w:rPr>
+          <w:t xml:space="preserve">NORC</w:t>
+        </w:r>
+      </w:hyperlink>
+      <w:r>
+        <w:t xml:space="preserve">.</w:t>
+      </w:r>
+    </w:p>
+    <w:bookmarkEnd w:id="80"/>
+    <w:bookmarkStart w:id="82" w:name="ref-hochschild1979emotion-624"/>
+    <w:p>
+      <w:pPr>
+        <w:pStyle w:val="Bibliography"/>
+      </w:pPr>
+      <w:r>
+        <w:t xml:space="preserve">Hochschild, Arlie Russell. 1979.</w:t>
+      </w:r>
+      <w:r>
+        <w:t xml:space="preserve"> </w:t>
+      </w:r>
+      <w:r>
+        <w:t xml:space="preserve">“Emotion Work, Feeling Rules, and Social Structure.”</w:t>
+      </w:r>
+      <w:r>
+        <w:t xml:space="preserve"> </w:t>
+      </w:r>
+      <w:r>
+        <w:rPr>
+          <w:iCs/>
+          <w:i/>
+        </w:rPr>
+        <w:t xml:space="preserve">The American Journal of Sociology</w:t>
+      </w:r>
+      <w:r>
+        <w:t xml:space="preserve"> </w:t>
+      </w:r>
+      <w:r>
+        <w:t xml:space="preserve">85(3):551–75. doi:</w:t>
+      </w:r>
+      <w:hyperlink r:id="rId81">
+        <w:r>
+          <w:rPr>
+            <w:rStyle w:val="Hyperlink"/>
+          </w:rPr>
+          <w:t xml:space="preserve">10.1086/227049</w:t>
+        </w:r>
+      </w:hyperlink>
+      <w:r>
+        <w:t xml:space="preserve">.</w:t>
+      </w:r>
+    </w:p>
+    <w:bookmarkEnd w:id="82"/>
+    <w:bookmarkStart w:id="84" w:name="ref-hogg2000social-e0d"/>
+    <w:p>
+      <w:pPr>
+        <w:pStyle w:val="Bibliography"/>
+      </w:pPr>
+      <w:r>
+        <w:t xml:space="preserve">Hogg, Michael A., and Deborah I. Terry. 2000.</w:t>
+      </w:r>
+      <w:r>
+        <w:t xml:space="preserve"> </w:t>
+      </w:r>
+      <w:r>
+        <w:t xml:space="preserve">“Social Identity and Self-Categorization Processes in Organizational Contexts.”</w:t>
+      </w:r>
+      <w:r>
+        <w:t xml:space="preserve"> </w:t>
+      </w:r>
+      <w:r>
+        <w:rPr>
+          <w:iCs/>
+          <w:i/>
+        </w:rPr>
+        <w:t xml:space="preserve">Academy of Management Review. Academy of Management</w:t>
+      </w:r>
+      <w:r>
+        <w:t xml:space="preserve"> </w:t>
+      </w:r>
+      <w:r>
+        <w:t xml:space="preserve">25(1):121–40. doi:</w:t>
+      </w:r>
+      <w:hyperlink r:id="rId83">
+        <w:r>
+          <w:rPr>
+            <w:rStyle w:val="Hyperlink"/>
+          </w:rPr>
+          <w:t xml:space="preserve">10.5465/amr.2000.2791606</w:t>
+        </w:r>
+      </w:hyperlink>
+      <w:r>
+        <w:t xml:space="preserve">.</w:t>
+      </w:r>
+    </w:p>
+    <w:bookmarkEnd w:id="84"/>
+    <w:bookmarkStart w:id="85" w:name="ref-janoski1996pathways"/>
+    <w:p>
+      <w:pPr>
+        <w:pStyle w:val="Bibliography"/>
+      </w:pPr>
+      <w:r>
+        <w:t xml:space="preserve">Janoski, Thomas, and John Wilson. 1996.</w:t>
+      </w:r>
+      <w:r>
+        <w:t xml:space="preserve"> </w:t>
+      </w:r>
+      <w:r>
+        <w:t xml:space="preserve">“Pathways to Voluntarism: Family Socialization and Status Transmission Models.”</w:t>
+      </w:r>
+      <w:r>
+        <w:t xml:space="preserve"> </w:t>
+      </w:r>
+      <w:r>
+        <w:rPr>
+          <w:iCs/>
+          <w:i/>
+        </w:rPr>
+        <w:t xml:space="preserve">Social Forces</w:t>
+      </w:r>
+      <w:r>
+        <w:t xml:space="preserve"> </w:t>
+      </w:r>
+      <w:r>
+        <w:t xml:space="preserve">74:271–92.</w:t>
+      </w:r>
+    </w:p>
+    <w:bookmarkEnd w:id="85"/>
+    <w:bookmarkStart w:id="87" w:name="ref-jost2017working-608"/>
+    <w:p>
+      <w:pPr>
+        <w:pStyle w:val="Bibliography"/>
+      </w:pPr>
+      <w:r>
+        <w:t xml:space="preserve">Jost, John T. 2017.</w:t>
+      </w:r>
+      <w:r>
+        <w:t xml:space="preserve"> </w:t>
+      </w:r>
+      <w:r>
+        <w:t xml:space="preserve">“Working Class Conservatism: A System Justification Perspective.”</w:t>
+      </w:r>
+      <w:r>
+        <w:t xml:space="preserve"> </w:t>
+      </w:r>
+      <w:r>
+        <w:rPr>
+          <w:iCs/>
+          <w:i/>
+        </w:rPr>
+        <w:t xml:space="preserve">Current Opinion in Psychology</w:t>
+      </w:r>
+      <w:r>
+        <w:t xml:space="preserve"> </w:t>
+      </w:r>
+      <w:r>
+        <w:t xml:space="preserve">18:73–78. doi:</w:t>
+      </w:r>
+      <w:hyperlink r:id="rId86">
+        <w:r>
+          <w:rPr>
+            <w:rStyle w:val="Hyperlink"/>
+          </w:rPr>
+          <w:t xml:space="preserve">10.1016/j.copsyc.2017.08.020</w:t>
+        </w:r>
+      </w:hyperlink>
+      <w:r>
+        <w:t xml:space="preserve">.</w:t>
+      </w:r>
+    </w:p>
+    <w:bookmarkEnd w:id="87"/>
+    <w:bookmarkStart w:id="89" w:name="ref-jost2017ideology-f69"/>
+    <w:p>
+      <w:pPr>
+        <w:pStyle w:val="Bibliography"/>
+      </w:pPr>
+      <w:r>
+        <w:t xml:space="preserve">Jost, John T., Melanie Langer, Vivienne Badaan, Flávio Azevedo, Edgardo Etchezahar, Joaquin Ungaretti, and Erin P. Hennes. 2017.</w:t>
+      </w:r>
+      <w:r>
+        <w:t xml:space="preserve"> </w:t>
+      </w:r>
+      <w:r>
+        <w:t xml:space="preserve">“Ideology and the Limits of Self-Interest: System Justification Motivation and Conservative Advantages in Mass Politics.”</w:t>
+      </w:r>
+      <w:r>
+        <w:t xml:space="preserve"> </w:t>
+      </w:r>
+      <w:r>
+        <w:rPr>
+          <w:iCs/>
+          <w:i/>
+        </w:rPr>
+        <w:t xml:space="preserve">Translational Issues in Psychological Science</w:t>
+      </w:r>
+      <w:r>
+        <w:t xml:space="preserve"> </w:t>
+      </w:r>
+      <w:r>
+        <w:t xml:space="preserve">3(3):e1–26. doi:</w:t>
+      </w:r>
+      <w:hyperlink r:id="rId88">
+        <w:r>
+          <w:rPr>
+            <w:rStyle w:val="Hyperlink"/>
+          </w:rPr>
+          <w:t xml:space="preserve">10.1037/tps0000127</w:t>
+        </w:r>
+      </w:hyperlink>
+      <w:r>
+        <w:t xml:space="preserve">.</w:t>
+      </w:r>
+    </w:p>
+    <w:bookmarkEnd w:id="89"/>
+    <w:bookmarkStart w:id="91" w:name="ref-jost2007are-871"/>
+    <w:p>
+      <w:pPr>
+        <w:pStyle w:val="Bibliography"/>
+      </w:pPr>
+      <w:r>
+        <w:t xml:space="preserve">Jost, John T., Jaime L. Napier, Hulda Thorisdottir, Samuel D. Gosling, Tibor P. Palfai, and Brian Ostafin. 2007.</w:t>
+      </w:r>
+      <w:r>
+        <w:t xml:space="preserve"> </w:t>
+      </w:r>
+      <w:r>
+        <w:t xml:space="preserve">“Are Needs to Manage Uncertainty and Threat Associated with Political Conservatism or Ideological Extremity?”</w:t>
+      </w:r>
+      <w:r>
+        <w:t xml:space="preserve"> </w:t>
+      </w:r>
+      <w:r>
+        <w:rPr>
+          <w:iCs/>
+          <w:i/>
+        </w:rPr>
+        <w:t xml:space="preserve">Personality and Social Psychology Bulletin</w:t>
+      </w:r>
+      <w:r>
+        <w:t xml:space="preserve"> </w:t>
+      </w:r>
+      <w:r>
+        <w:t xml:space="preserve">33(7):989–1007. doi:</w:t>
+      </w:r>
+      <w:hyperlink r:id="rId90">
+        <w:r>
+          <w:rPr>
+            <w:rStyle w:val="Hyperlink"/>
+          </w:rPr>
+          <w:t xml:space="preserve">10.1177/0146167207301028</w:t>
+        </w:r>
+      </w:hyperlink>
+      <w:r>
+        <w:t xml:space="preserve">.</w:t>
+      </w:r>
+    </w:p>
+    <w:bookmarkEnd w:id="91"/>
+    <w:bookmarkStart w:id="93" w:name="ref-jost2008ideology-368"/>
+    <w:p>
+      <w:pPr>
+        <w:pStyle w:val="Bibliography"/>
+      </w:pPr>
+      <w:r>
+        <w:t xml:space="preserve">Jost, John T., Brian A. Nosek, and Samuel D. Gosling. 2008.</w:t>
+      </w:r>
+      <w:r>
+        <w:t xml:space="preserve"> </w:t>
+      </w:r>
+      <w:r>
+        <w:t xml:space="preserve">“Ideology: Its Resurgence in Social, Personality, and Political Psychology.”</w:t>
+      </w:r>
+      <w:r>
+        <w:t xml:space="preserve"> </w:t>
+      </w:r>
+      <w:r>
+        <w:rPr>
+          <w:iCs/>
+          <w:i/>
+        </w:rPr>
+        <w:t xml:space="preserve">Perspectives on Psychological Science</w:t>
+      </w:r>
+      <w:r>
+        <w:t xml:space="preserve"> </w:t>
+      </w:r>
+      <w:r>
+        <w:t xml:space="preserve">3(2):126–36. doi:</w:t>
+      </w:r>
+      <w:hyperlink r:id="rId92">
+        <w:r>
+          <w:rPr>
+            <w:rStyle w:val="Hyperlink"/>
+          </w:rPr>
+          <w:t xml:space="preserve">10.1111/j.1745-6916.2008.00070.x</w:t>
+        </w:r>
+      </w:hyperlink>
+      <w:r>
+        <w:t xml:space="preserve">.</w:t>
+      </w:r>
+    </w:p>
+    <w:bookmarkEnd w:id="93"/>
+    <w:bookmarkStart w:id="95" w:name="ref-jost2003social-206"/>
+    <w:p>
+      <w:pPr>
+        <w:pStyle w:val="Bibliography"/>
+      </w:pPr>
+      <w:r>
+        <w:t xml:space="preserve">Jost, John T., Brett W. Pelham, Oliver Sheldon, and Bilian Ni Sullivan. 2003.</w:t>
+      </w:r>
+      <w:r>
+        <w:t xml:space="preserve"> </w:t>
+      </w:r>
+      <w:r>
+        <w:t xml:space="preserve">“Social Inequality and the Reduction of Ideological Dissonance on Behalf of the System: Evidence of Enhanced System Justification Among the Disadvantaged.”</w:t>
+      </w:r>
+      <w:r>
+        <w:t xml:space="preserve"> </w:t>
+      </w:r>
+      <w:r>
+        <w:rPr>
+          <w:iCs/>
+          <w:i/>
+        </w:rPr>
+        <w:t xml:space="preserve">European Journal of Social Psychology</w:t>
+      </w:r>
+      <w:r>
+        <w:t xml:space="preserve"> </w:t>
+      </w:r>
+      <w:r>
+        <w:t xml:space="preserve">33(1):13–36. doi:</w:t>
+      </w:r>
+      <w:hyperlink r:id="rId94">
+        <w:r>
+          <w:rPr>
+            <w:rStyle w:val="Hyperlink"/>
+          </w:rPr>
+          <w:t xml:space="preserve">10.1002/ejsp.127</w:t>
+        </w:r>
+      </w:hyperlink>
+      <w:r>
+        <w:t xml:space="preserve">.</w:t>
+      </w:r>
+    </w:p>
+    <w:bookmarkEnd w:id="95"/>
+    <w:bookmarkStart w:id="96" w:name="ref-knoke1986associations"/>
+    <w:p>
+      <w:pPr>
+        <w:pStyle w:val="Bibliography"/>
+      </w:pPr>
+      <w:r>
+        <w:t xml:space="preserve">Knoke, David. 1986.</w:t>
+      </w:r>
+      <w:r>
+        <w:t xml:space="preserve"> </w:t>
+      </w:r>
+      <w:r>
+        <w:t xml:space="preserve">“Associations and Interest Groups.”</w:t>
+      </w:r>
+      <w:r>
+        <w:t xml:space="preserve"> </w:t>
+      </w:r>
+      <w:r>
+        <w:rPr>
+          <w:iCs/>
+          <w:i/>
+        </w:rPr>
+        <w:t xml:space="preserve">Annual Review of Sociology</w:t>
+      </w:r>
+      <w:r>
+        <w:t xml:space="preserve"> </w:t>
+      </w:r>
+      <w:r>
+        <w:t xml:space="preserve">12:1–21.</w:t>
+      </w:r>
+    </w:p>
+    <w:bookmarkEnd w:id="96"/>
+    <w:bookmarkStart w:id="98" w:name="ref-kohn1977class-ee1"/>
+    <w:p>
+      <w:pPr>
+        <w:pStyle w:val="Bibliography"/>
+      </w:pPr>
+      <w:r>
+        <w:t xml:space="preserve">Kohn, Melvin L. 1977.</w:t>
+      </w:r>
+      <w:r>
+        <w:t xml:space="preserve"> </w:t>
+      </w:r>
+      <w:hyperlink r:id="rId97">
+        <w:r>
+          <w:rPr>
+            <w:rStyle w:val="Hyperlink"/>
+            <w:iCs/>
+            <w:i/>
+          </w:rPr>
+          <w:t xml:space="preserve">Class and Conformity: A Study in Values, with a Reassessment, 1977</w:t>
+        </w:r>
+      </w:hyperlink>
+      <w:r>
+        <w:t xml:space="preserve">. University of Chicago Press.</w:t>
+      </w:r>
+    </w:p>
+    <w:bookmarkEnd w:id="98"/>
+    <w:bookmarkStart w:id="99" w:name="ref-kohn1969class"/>
+    <w:p>
+      <w:pPr>
+        <w:pStyle w:val="Bibliography"/>
+      </w:pPr>
+      <w:r>
+        <w:t xml:space="preserve">Kohn, Melvin L., and Carmi Schooler. 1969.</w:t>
+      </w:r>
+      <w:r>
+        <w:t xml:space="preserve"> </w:t>
+      </w:r>
+      <w:r>
+        <w:t xml:space="preserve">“Class, Occupation, and Orientation.”</w:t>
+      </w:r>
+      <w:r>
+        <w:t xml:space="preserve"> </w:t>
+      </w:r>
+      <w:r>
+        <w:rPr>
+          <w:iCs/>
+          <w:i/>
+        </w:rPr>
+        <w:t xml:space="preserve">American Sociological Review</w:t>
+      </w:r>
+      <w:r>
+        <w:t xml:space="preserve"> </w:t>
+      </w:r>
+      <w:r>
+        <w:t xml:space="preserve">34:659–78.</w:t>
+      </w:r>
+    </w:p>
+    <w:bookmarkEnd w:id="99"/>
+    <w:bookmarkStart w:id="101" w:name="ref-kohn1978reciprocal-f1b"/>
+    <w:p>
+      <w:pPr>
+        <w:pStyle w:val="Bibliography"/>
+      </w:pPr>
+      <w:r>
+        <w:t xml:space="preserve">Kohn, Melvin L., and Carmi Schooler. 1978.</w:t>
+      </w:r>
+      <w:r>
+        <w:t xml:space="preserve"> </w:t>
+      </w:r>
+      <w:r>
+        <w:t xml:space="preserve">“The Reciprocal Effects of the Substantive Complexity of Work and Intellectual Flexibility: A Longitudinal Assessment.”</w:t>
+      </w:r>
+      <w:r>
+        <w:t xml:space="preserve"> </w:t>
+      </w:r>
+      <w:r>
+        <w:rPr>
+          <w:iCs/>
+          <w:i/>
+        </w:rPr>
+        <w:t xml:space="preserve">American Journal of Sociology</w:t>
+      </w:r>
+      <w:r>
+        <w:t xml:space="preserve"> </w:t>
+      </w:r>
+      <w:r>
+        <w:t xml:space="preserve">84(1):24–52. doi:</w:t>
+      </w:r>
+      <w:hyperlink r:id="rId100">
+        <w:r>
+          <w:rPr>
+            <w:rStyle w:val="Hyperlink"/>
+          </w:rPr>
+          <w:t xml:space="preserve">10.1086/226739</w:t>
+        </w:r>
+      </w:hyperlink>
+      <w:r>
+        <w:t xml:space="preserve">.</w:t>
+      </w:r>
+    </w:p>
+    <w:bookmarkEnd w:id="101"/>
+    <w:bookmarkStart w:id="103" w:name="ref-lawler1992affective-8c8"/>
+    <w:p>
+      <w:pPr>
+        <w:pStyle w:val="Bibliography"/>
+      </w:pPr>
+      <w:r>
+        <w:t xml:space="preserve">Lawler, Edward J. 1992.</w:t>
+      </w:r>
+      <w:r>
+        <w:t xml:space="preserve"> </w:t>
+      </w:r>
+      <w:r>
+        <w:t xml:space="preserve">“Affective Attachments to Nested Groups: A Choice-Process Theory.”</w:t>
+      </w:r>
+      <w:r>
+        <w:t xml:space="preserve"> </w:t>
+      </w:r>
+      <w:r>
+        <w:rPr>
+          <w:iCs/>
+          <w:i/>
+        </w:rPr>
+        <w:t xml:space="preserve">American Sociological Review</w:t>
+      </w:r>
+      <w:r>
+        <w:t xml:space="preserve"> </w:t>
+      </w:r>
+      <w:r>
+        <w:t xml:space="preserve">57(3):327. doi:</w:t>
+      </w:r>
+      <w:hyperlink r:id="rId102">
+        <w:r>
+          <w:rPr>
+            <w:rStyle w:val="Hyperlink"/>
+          </w:rPr>
+          <w:t xml:space="preserve">10.2307/2096239</w:t>
+        </w:r>
+      </w:hyperlink>
+      <w:r>
+        <w:t xml:space="preserve">.</w:t>
+      </w:r>
+    </w:p>
+    <w:bookmarkEnd w:id="103"/>
+    <w:bookmarkStart w:id="104" w:name="ref-lawler2006commitment-b3a"/>
+    <w:p>
+      <w:pPr>
+        <w:pStyle w:val="Bibliography"/>
+      </w:pPr>
+      <w:r>
+        <w:t xml:space="preserve">Lawler, Edward J., Shane R. Thye, and Jeongkoo Yoon. 2006.</w:t>
+      </w:r>
+      <w:r>
+        <w:t xml:space="preserve"> </w:t>
+      </w:r>
+      <w:r>
+        <w:t xml:space="preserve">“Commitment in Structurally Enabled and Induced Exchange Relations.”</w:t>
+      </w:r>
+      <w:r>
+        <w:t xml:space="preserve"> </w:t>
+      </w:r>
+      <w:r>
+        <w:rPr>
+          <w:iCs/>
+          <w:i/>
+        </w:rPr>
+        <w:t xml:space="preserve">Social Psychology Quarterly</w:t>
+      </w:r>
+      <w:r>
+        <w:t xml:space="preserve"> </w:t>
+      </w:r>
+      <w:r>
+        <w:t xml:space="preserve">69(2):183–200.</w:t>
+      </w:r>
+    </w:p>
+    <w:bookmarkEnd w:id="104"/>
+    <w:bookmarkStart w:id="105" w:name="ref-mcpherson1981dynamic"/>
+    <w:p>
+      <w:pPr>
+        <w:pStyle w:val="Bibliography"/>
+      </w:pPr>
+      <w:r>
+        <w:t xml:space="preserve">McPherson, J. Miller. 1981.</w:t>
+      </w:r>
+      <w:r>
+        <w:t xml:space="preserve"> </w:t>
+      </w:r>
+      <w:r>
+        <w:t xml:space="preserve">“A Dynamic Model of Voluntary Affiliation.”</w:t>
+      </w:r>
+      <w:r>
+        <w:t xml:space="preserve"> </w:t>
+      </w:r>
+      <w:r>
+        <w:rPr>
+          <w:iCs/>
+          <w:i/>
+        </w:rPr>
+        <w:t xml:space="preserve">Social Forces</w:t>
+      </w:r>
+      <w:r>
+        <w:t xml:space="preserve"> </w:t>
+      </w:r>
+      <w:r>
+        <w:t xml:space="preserve">59:705–28.</w:t>
+      </w:r>
+    </w:p>
+    <w:bookmarkEnd w:id="105"/>
+    <w:bookmarkStart w:id="106" w:name="ref-mueller1999commitment"/>
+    <w:p>
+      <w:pPr>
+        <w:pStyle w:val="Bibliography"/>
+      </w:pPr>
+      <w:r>
+        <w:t xml:space="preserve">Mueller, Charles W., and Edward J. Lawler. 1999.</w:t>
+      </w:r>
+      <w:r>
+        <w:t xml:space="preserve"> </w:t>
+      </w:r>
+      <w:r>
+        <w:t xml:space="preserve">“Commitment to Nested Organizational Units: Some Basic Principles and Preliminary Findings.”</w:t>
+      </w:r>
+      <w:r>
+        <w:t xml:space="preserve"> </w:t>
+      </w:r>
+      <w:r>
+        <w:rPr>
+          <w:iCs/>
+          <w:i/>
+        </w:rPr>
+        <w:t xml:space="preserve">Social Psychology Quarterly</w:t>
+      </w:r>
+      <w:r>
+        <w:t xml:space="preserve"> </w:t>
+      </w:r>
+      <w:r>
+        <w:t xml:space="preserve">62:325–46.</w:t>
+      </w:r>
+    </w:p>
+    <w:bookmarkEnd w:id="106"/>
+    <w:bookmarkStart w:id="107" w:name="ref-perrin2005national"/>
+    <w:p>
+      <w:pPr>
+        <w:pStyle w:val="Bibliography"/>
+      </w:pPr>
+      <w:r>
+        <w:t xml:space="preserve">Perrin, Andrew J. 2005.</w:t>
+      </w:r>
+      <w:r>
+        <w:t xml:space="preserve"> </w:t>
+      </w:r>
+      <w:r>
+        <w:t xml:space="preserve">“National Threat and Political Culture: Authoritarianism, Antiauthoritarianism, and the September 11 Attacks.”</w:t>
+      </w:r>
+      <w:r>
+        <w:t xml:space="preserve"> </w:t>
+      </w:r>
+      <w:r>
+        <w:rPr>
+          <w:iCs/>
+          <w:i/>
+        </w:rPr>
+        <w:t xml:space="preserve">Political Psychology</w:t>
+      </w:r>
+      <w:r>
+        <w:t xml:space="preserve"> </w:t>
+      </w:r>
+      <w:r>
+        <w:t xml:space="preserve">26(2):167–94.</w:t>
+      </w:r>
+    </w:p>
+    <w:bookmarkEnd w:id="107"/>
+    <w:bookmarkStart w:id="108" w:name="ref-pettigrew1999placing"/>
+    <w:p>
+      <w:pPr>
+        <w:pStyle w:val="Bibliography"/>
+      </w:pPr>
+      <w:r>
+        <w:t xml:space="preserve">Pettigrew, Thomas F. 1999.</w:t>
+      </w:r>
+      <w:r>
+        <w:t xml:space="preserve"> </w:t>
+      </w:r>
+      <w:r>
+        <w:t xml:space="preserve">“Placing Authoritarianism in Social Context.”</w:t>
+      </w:r>
+      <w:r>
+        <w:t xml:space="preserve"> </w:t>
+      </w:r>
+      <w:r>
+        <w:rPr>
+          <w:iCs/>
+          <w:i/>
+        </w:rPr>
+        <w:t xml:space="preserve">Politics, Groups, and the Individual</w:t>
+      </w:r>
+      <w:r>
+        <w:t xml:space="preserve"> </w:t>
+      </w:r>
+      <w:r>
+        <w:t xml:space="preserve">8(5).</w:t>
+      </w:r>
+    </w:p>
+    <w:bookmarkEnd w:id="108"/>
+    <w:bookmarkStart w:id="110" w:name="ref-rcoreteam2024language"/>
+    <w:p>
+      <w:pPr>
+        <w:pStyle w:val="Bibliography"/>
+      </w:pPr>
+      <w:r>
+        <w:t xml:space="preserve">R Core Team. 2024.</w:t>
+      </w:r>
+      <w:r>
+        <w:t xml:space="preserve"> </w:t>
+      </w:r>
+      <w:r>
+        <w:t xml:space="preserve">“</w:t>
+      </w:r>
+      <w:hyperlink r:id="rId109">
+        <w:r>
+          <w:rPr>
+            <w:rStyle w:val="Hyperlink"/>
+          </w:rPr>
+          <w:t xml:space="preserve">R: A Language and Environment for Statistical Computing</w:t>
+        </w:r>
+      </w:hyperlink>
+      <w:r>
+        <w:t xml:space="preserve">.”</w:t>
+      </w:r>
+    </w:p>
+    <w:bookmarkEnd w:id="110"/>
+    <w:bookmarkStart w:id="112" w:name="ref-santos2024liberal-conservative-a61"/>
+    <w:p>
+      <w:pPr>
+        <w:pStyle w:val="Bibliography"/>
+      </w:pPr>
+      <w:r>
+        <w:t xml:space="preserve">Santos, Débora de Oliveira, and John T. Jost. 2024.</w:t>
+      </w:r>
+      <w:r>
+        <w:t xml:space="preserve"> </w:t>
+      </w:r>
+      <w:r>
+        <w:t xml:space="preserve">“Liberal-Conservative Asymmetries in Anti-Democratic Tendencies Are Partly Explained by Psychological Differences in a Nationally Representative u.s. Sample.”</w:t>
+      </w:r>
+      <w:r>
+        <w:t xml:space="preserve"> </w:t>
+      </w:r>
+      <w:r>
+        <w:rPr>
+          <w:iCs/>
+          <w:i/>
+        </w:rPr>
+        <w:t xml:space="preserve">Communications Psychology</w:t>
+      </w:r>
+      <w:r>
+        <w:t xml:space="preserve"> </w:t>
+      </w:r>
+      <w:r>
+        <w:t xml:space="preserve">2(1):61. doi:</w:t>
+      </w:r>
+      <w:hyperlink r:id="rId111">
+        <w:r>
+          <w:rPr>
+            <w:rStyle w:val="Hyperlink"/>
+          </w:rPr>
+          <w:t xml:space="preserve">10.1038/s44271-024-00096-3</w:t>
+        </w:r>
+      </w:hyperlink>
+      <w:r>
+        <w:t xml:space="preserve">.</w:t>
+      </w:r>
+    </w:p>
+    <w:bookmarkEnd w:id="112"/>
+    <w:bookmarkStart w:id="113" w:name="ref-schatz2007waving"/>
+    <w:p>
+      <w:pPr>
+        <w:pStyle w:val="Bibliography"/>
+      </w:pPr>
+      <w:r>
+        <w:t xml:space="preserve">Schatz, Robert T., and Howard Lavine. 2007.</w:t>
+      </w:r>
+      <w:r>
+        <w:t xml:space="preserve"> </w:t>
+      </w:r>
+      <w:r>
+        <w:t xml:space="preserve">“Waving the Flag: National Symbolism, Social Identity, and Political Engagement.”</w:t>
+      </w:r>
+      <w:r>
+        <w:t xml:space="preserve"> </w:t>
+      </w:r>
+      <w:r>
+        <w:rPr>
+          <w:iCs/>
+          <w:i/>
+        </w:rPr>
+        <w:t xml:space="preserve">Political Psychology</w:t>
+      </w:r>
+      <w:r>
+        <w:t xml:space="preserve"> </w:t>
+      </w:r>
+      <w:r>
+        <w:t xml:space="preserve">28(3):329–55.</w:t>
+      </w:r>
+    </w:p>
+    <w:bookmarkEnd w:id="113"/>
+    <w:bookmarkStart w:id="114" w:name="ref-schatz1999varieties"/>
+    <w:p>
+      <w:pPr>
+        <w:pStyle w:val="Bibliography"/>
+      </w:pPr>
+      <w:r>
+        <w:t xml:space="preserve">Schatz, Robert T., Ervin Staub, and Howard Lavine. 1999.</w:t>
+      </w:r>
+      <w:r>
+        <w:t xml:space="preserve"> </w:t>
+      </w:r>
+      <w:r>
+        <w:t xml:space="preserve">“On the Varieties of National Attachment: Blind Versus Constructive Patriotism.”</w:t>
+      </w:r>
+      <w:r>
+        <w:t xml:space="preserve"> </w:t>
+      </w:r>
+      <w:r>
+        <w:rPr>
+          <w:iCs/>
+          <w:i/>
+        </w:rPr>
+        <w:t xml:space="preserve">Political Psychology</w:t>
+      </w:r>
+      <w:r>
+        <w:t xml:space="preserve"> </w:t>
+      </w:r>
+      <w:r>
+        <w:t xml:space="preserve">20(1):151–74.</w:t>
+      </w:r>
+    </w:p>
+    <w:bookmarkEnd w:id="114"/>
+    <w:bookmarkStart w:id="115" w:name="ref-scott1957membership"/>
+    <w:p>
+      <w:pPr>
+        <w:pStyle w:val="Bibliography"/>
+      </w:pPr>
+      <w:r>
+        <w:t xml:space="preserve">Scott, John C. 1957.</w:t>
+      </w:r>
+      <w:r>
+        <w:t xml:space="preserve"> </w:t>
+      </w:r>
+      <w:r>
+        <w:t xml:space="preserve">“Membership and Participation in Voluntary Associations.”</w:t>
+      </w:r>
+      <w:r>
+        <w:t xml:space="preserve"> </w:t>
+      </w:r>
+      <w:r>
+        <w:rPr>
+          <w:iCs/>
+          <w:i/>
+        </w:rPr>
+        <w:t xml:space="preserve">American Sociological Review</w:t>
+      </w:r>
+      <w:r>
+        <w:t xml:space="preserve"> </w:t>
+      </w:r>
+      <w:r>
+        <w:t xml:space="preserve">22:315–26.</w:t>
+      </w:r>
+    </w:p>
+    <w:bookmarkEnd w:id="115"/>
+    <w:bookmarkStart w:id="117" w:name="ref-smith2021general-9ca"/>
+    <w:p>
+      <w:pPr>
+        <w:pStyle w:val="Bibliography"/>
+      </w:pPr>
+      <w:r>
+        <w:t xml:space="preserve">Smith, Tom W., Michael Hout, and Peter V. Marsden. 2021.</w:t>
+      </w:r>
+      <w:r>
+        <w:t xml:space="preserve"> </w:t>
+      </w:r>
+      <w:r>
+        <w:t xml:space="preserve">“The General Social Survey, 1972–2021: Cumulative Codebook and Data Documentation.”</w:t>
+      </w:r>
+      <w:r>
+        <w:t xml:space="preserve"> </w:t>
+      </w:r>
+      <w:hyperlink r:id="rId116">
+        <w:r>
+          <w:rPr>
+            <w:rStyle w:val="Hyperlink"/>
+          </w:rPr>
+          <w:t xml:space="preserve">https://gss.norc.org/</w:t>
+        </w:r>
+      </w:hyperlink>
+      <w:r>
+        <w:t xml:space="preserve">.</w:t>
+      </w:r>
+    </w:p>
+    <w:bookmarkEnd w:id="117"/>
+    <w:bookmarkStart w:id="119" w:name="ref-smith2006national"/>
+    <w:p>
+      <w:pPr>
+        <w:pStyle w:val="Bibliography"/>
+      </w:pPr>
+      <w:r>
+        <w:t xml:space="preserve">Smith, Tom W., and Seokho Kim. 2006.</w:t>
+      </w:r>
+      <w:r>
+        <w:t xml:space="preserve"> </w:t>
+      </w:r>
+      <w:r>
+        <w:t xml:space="preserve">“National Pride in Comparative Perspective: 1995/96 and 2003/04.”</w:t>
+      </w:r>
+      <w:r>
+        <w:t xml:space="preserve"> </w:t>
+      </w:r>
+      <w:r>
+        <w:rPr>
+          <w:iCs/>
+          <w:i/>
+        </w:rPr>
+        <w:t xml:space="preserve">International Journal of Public Opinion Research</w:t>
+      </w:r>
+      <w:r>
+        <w:t xml:space="preserve"> </w:t>
+      </w:r>
+      <w:r>
+        <w:t xml:space="preserve">18(1):127–36. doi:</w:t>
+      </w:r>
+      <w:hyperlink r:id="rId118">
+        <w:r>
+          <w:rPr>
+            <w:rStyle w:val="Hyperlink"/>
+          </w:rPr>
+          <w:t xml:space="preserve">10.1093/ijpor/edk007</w:t>
+        </w:r>
+      </w:hyperlink>
+      <w:r>
+        <w:t xml:space="preserve">.</w:t>
+      </w:r>
+    </w:p>
+    <w:bookmarkEnd w:id="119"/>
+    <w:bookmarkStart w:id="120" w:name="ref-sullivan1992patriotism"/>
+    <w:p>
+      <w:pPr>
+        <w:pStyle w:val="Bibliography"/>
+      </w:pPr>
+      <w:r>
+        <w:t xml:space="preserve">Sullivan, John L., Amy Fried, and Mary G. Dietz. 1992.</w:t>
+      </w:r>
+      <w:r>
+        <w:t xml:space="preserve"> </w:t>
+      </w:r>
+      <w:r>
+        <w:t xml:space="preserve">“Patriotism, Politics, and the Presidential Election of 1988.”</w:t>
+      </w:r>
+      <w:r>
+        <w:t xml:space="preserve"> </w:t>
+      </w:r>
+      <w:r>
+        <w:rPr>
+          <w:iCs/>
+          <w:i/>
+        </w:rPr>
+        <w:t xml:space="preserve">American Journal of Political Science</w:t>
+      </w:r>
+      <w:r>
+        <w:t xml:space="preserve"> </w:t>
+      </w:r>
+      <w:r>
+        <w:t xml:space="preserve">36(1):200–234.</w:t>
+      </w:r>
+    </w:p>
+    <w:bookmarkEnd w:id="120"/>
+    <w:bookmarkStart w:id="121" w:name="ref-swidler1992inequality"/>
+    <w:p>
+      <w:pPr>
+        <w:pStyle w:val="Bibliography"/>
+      </w:pPr>
+      <w:r>
+        <w:t xml:space="preserve">Swidler, Ann. 1992.</w:t>
+      </w:r>
+      <w:r>
+        <w:t xml:space="preserve"> </w:t>
+      </w:r>
+      <w:r>
+        <w:t xml:space="preserve">“Inequality and American Culture: The Persistence of Voluntarism.”</w:t>
+      </w:r>
+      <w:r>
+        <w:t xml:space="preserve"> </w:t>
+      </w:r>
+      <w:r>
+        <w:rPr>
+          <w:iCs/>
+          <w:i/>
+        </w:rPr>
+        <w:t xml:space="preserve">American Behavioral Scientist</w:t>
+      </w:r>
+      <w:r>
+        <w:t xml:space="preserve"> </w:t>
+      </w:r>
+      <w:r>
+        <w:t xml:space="preserve">35(4-5):606–29.</w:t>
+      </w:r>
+    </w:p>
+    <w:bookmarkEnd w:id="121"/>
+    <w:bookmarkStart w:id="122" w:name="ref-tomeh1973formal"/>
+    <w:p>
+      <w:pPr>
+        <w:pStyle w:val="Bibliography"/>
+      </w:pPr>
+      <w:r>
+        <w:t xml:space="preserve">Tomeh, Aida K. 1973.</w:t>
+      </w:r>
+      <w:r>
+        <w:t xml:space="preserve"> </w:t>
+      </w:r>
+      <w:r>
+        <w:t xml:space="preserve">“Formal Voluntary Organizations: Participation, Correlates, and Interrelationships.”</w:t>
+      </w:r>
+      <w:r>
+        <w:t xml:space="preserve"> </w:t>
+      </w:r>
+      <w:r>
+        <w:rPr>
+          <w:iCs/>
+          <w:i/>
+        </w:rPr>
+        <w:t xml:space="preserve">Sociological Inquiry</w:t>
+      </w:r>
+      <w:r>
+        <w:t xml:space="preserve"> </w:t>
+      </w:r>
+      <w:r>
+        <w:t xml:space="preserve">43:89–122.</w:t>
+      </w:r>
+    </w:p>
+    <w:bookmarkEnd w:id="122"/>
+    <w:bookmarkStart w:id="124" w:name="ref-wickham2016ggplot2"/>
+    <w:p>
+      <w:pPr>
+        <w:pStyle w:val="Bibliography"/>
+      </w:pPr>
+      <w:r>
+        <w:t xml:space="preserve">Wickham, Hadley. 2016.</w:t>
+      </w:r>
+      <w:r>
+        <w:t xml:space="preserve"> </w:t>
+      </w:r>
+      <w:hyperlink r:id="rId123">
+        <w:r>
+          <w:rPr>
+            <w:rStyle w:val="Hyperlink"/>
+            <w:iCs/>
+            <w:i/>
+          </w:rPr>
+          <w:t xml:space="preserve">Ggplot2: Elegant Graphics for Data Analysis</w:t>
+        </w:r>
+      </w:hyperlink>
+      <w:r>
+        <w:t xml:space="preserve">. Springer-Verlag New York.</w:t>
+      </w:r>
+    </w:p>
+    <w:bookmarkEnd w:id="124"/>
+    <w:bookmarkStart w:id="126" w:name="ref-wickham2023dplyr"/>
+    <w:p>
+      <w:pPr>
+        <w:pStyle w:val="Bibliography"/>
+      </w:pPr>
+      <w:r>
+        <w:t xml:space="preserve">Wickham, Hadley, Romain François, Lionel Henry, Kirill Müller, and Davis Vaughan. 2023.</w:t>
+      </w:r>
+      <w:r>
+        <w:t xml:space="preserve"> </w:t>
+      </w:r>
+      <w:hyperlink r:id="rId125">
+        <w:r>
+          <w:rPr>
+            <w:rStyle w:val="Hyperlink"/>
+            <w:iCs/>
+            <w:i/>
+          </w:rPr>
+          <w:t xml:space="preserve">Dplyr: A Grammar of Data Manipulation</w:t>
+        </w:r>
+      </w:hyperlink>
+      <w:r>
+        <w:t xml:space="preserve">.</w:t>
+      </w:r>
+    </w:p>
+    <w:bookmarkEnd w:id="126"/>
+    <w:bookmarkStart w:id="128" w:name="ref-wickham2023tidyr"/>
+    <w:p>
+      <w:pPr>
+        <w:pStyle w:val="Bibliography"/>
+      </w:pPr>
+      <w:r>
+        <w:t xml:space="preserve">Wickham, Hadley, and Davis Vaughan. 2023.</w:t>
+      </w:r>
+      <w:r>
+        <w:t xml:space="preserve"> </w:t>
+      </w:r>
+      <w:hyperlink r:id="rId127">
+        <w:r>
+          <w:rPr>
+            <w:rStyle w:val="Hyperlink"/>
+            <w:iCs/>
+            <w:i/>
+          </w:rPr>
+          <w:t xml:space="preserve">Tidyr: Tidy Messy Data</w:t>
+        </w:r>
+      </w:hyperlink>
+      <w:r>
+        <w:t xml:space="preserve">.</w:t>
+      </w:r>
+    </w:p>
+    <w:bookmarkEnd w:id="128"/>
+    <w:bookmarkStart w:id="129" w:name="ref-wuthnow2019left-c34"/>
+    <w:p>
+      <w:pPr>
+        <w:pStyle w:val="Bibliography"/>
+      </w:pPr>
+      <w:r>
+        <w:t xml:space="preserve">Wuthnow, Robert. 2019.</w:t>
+      </w:r>
+      <w:r>
+        <w:t xml:space="preserve"> </w:t>
+      </w:r>
+      <w:r>
+        <w:rPr>
+          <w:iCs/>
+          <w:i/>
+        </w:rPr>
+        <w:t xml:space="preserve">The Left Behind, Decline and Rage in Small-Town America</w:t>
+      </w:r>
+      <w:r>
+        <w:t xml:space="preserve">. Princeton, NJ: Princeton University Press.</w:t>
+      </w:r>
+    </w:p>
+    <w:bookmarkEnd w:id="129"/>
+    <w:bookmarkEnd w:id="130"/>
+    <w:bookmarkEnd w:id="131"/>
     <w:sectPr/>
   </w:body>
 </w:document>

</xml_diff>